<commit_message>
fixed video and SRF pdf
</commit_message>
<xml_diff>
--- a/docs/SRF/SRF.docx
+++ b/docs/SRF/SRF.docx
@@ -435,7 +435,7 @@
     </w:p>
     <w:bookmarkEnd w:id="18"/>
     <w:bookmarkEnd w:id="19"/>
-    <w:bookmarkStart w:id="30" w:name="review-of-different-sources"/>
+    <w:bookmarkStart w:id="32" w:name="review-of-different-sources"/>
     <w:p>
       <w:pPr>
         <w:pStyle w:val="Heading1"/>
@@ -452,405 +452,242 @@
         <w:t xml:space="preserve">This section summarizes the registration forms and reference documents reviewed in the preparation of the SRF. Each entry describes the source, the population it covers, and the data points it contributes to the overlap analysis in the next section.</w:t>
       </w:r>
     </w:p>
-    <w:bookmarkStart w:id="20" w:name="gt-sources"/>
     <w:p>
       <w:pPr>
         <w:pStyle w:val="BodyText"/>
-      </w:pPr>
-      <w:r>
-        <w:t xml:space="preserve">Sources reviewed</w:t>
-      </w:r>
-    </w:p>
-    <w:p>
-      <w:pPr>
-        <w:pStyle w:val="BodyText"/>
-      </w:pPr>
-      <w:r>
-        <w:t xml:space="preserve">Registration forms and reference documents informing the SRF</w:t>
-      </w:r>
-    </w:p>
-    <w:p>
-      <w:pPr>
-        <w:pStyle w:val="BodyText"/>
-      </w:pPr>
-      <w:r>
-        <w:t xml:space="preserve">Source</w:t>
-      </w:r>
-    </w:p>
-    <w:p>
-      <w:pPr>
-        <w:pStyle w:val="BodyText"/>
-      </w:pPr>
-      <w:r>
-        <w:t xml:space="preserve">Type</w:t>
-      </w:r>
-    </w:p>
-    <w:p>
-      <w:pPr>
-        <w:pStyle w:val="BodyText"/>
-      </w:pPr>
-      <w:r>
-        <w:t xml:space="preserve">Member orgs / scope</w:t>
-      </w:r>
-    </w:p>
-    <w:p>
-      <w:pPr>
-        <w:pStyle w:val="BodyText"/>
-      </w:pPr>
-      <w:r>
-        <w:t xml:space="preserve">Principal contribution to SRF</w:t>
-      </w:r>
-    </w:p>
-    <w:p>
-      <w:pPr>
-        <w:pStyle w:val="BodyText"/>
-      </w:pPr>
-      <w:r>
-        <w:t xml:space="preserve">IOM</w:t>
-      </w:r>
-    </w:p>
-    <w:p>
-      <w:pPr>
-        <w:pStyle w:val="BodyText"/>
-      </w:pPr>
-      <w:r>
-        <w:t xml:space="preserve">Registration form</w:t>
-      </w:r>
-    </w:p>
-    <w:p>
-      <w:pPr>
-        <w:pStyle w:val="BodyText"/>
-      </w:pPr>
-      <w:r>
-        <w:t xml:space="preserve">IOM (DTM and operational programmes)</w:t>
-      </w:r>
-    </w:p>
-    <w:p>
-      <w:pPr>
-        <w:pStyle w:val="BodyText"/>
-      </w:pPr>
-      <w:r>
-        <w:t xml:space="preserve">Metadata and Biometrics fields; closest to the IDEHA pilot draft</w:t>
-      </w:r>
-    </w:p>
-    <w:p>
-      <w:pPr>
-        <w:pStyle w:val="BodyText"/>
-      </w:pPr>
-      <w:r>
-        <w:t xml:space="preserve">WFP</w:t>
-      </w:r>
-    </w:p>
-    <w:p>
-      <w:pPr>
-        <w:pStyle w:val="BodyText"/>
-      </w:pPr>
-      <w:r>
-        <w:t xml:space="preserve">Registration form</w:t>
-      </w:r>
-    </w:p>
-    <w:p>
-      <w:pPr>
-        <w:pStyle w:val="BodyText"/>
-      </w:pPr>
-      <w:r>
-        <w:t xml:space="preserve">WFP</w:t>
-      </w:r>
-    </w:p>
-    <w:p>
-      <w:pPr>
-        <w:pStyle w:val="BodyText"/>
-      </w:pPr>
-      <w:r>
-        <w:t xml:space="preserve">Other / payment fields; targeting and contact details</w:t>
-      </w:r>
-    </w:p>
-    <w:p>
-      <w:pPr>
-        <w:pStyle w:val="BodyText"/>
-      </w:pPr>
-      <w:r>
-        <w:t xml:space="preserve">Cash Consortium (CC)</w:t>
-      </w:r>
-    </w:p>
-    <w:p>
-      <w:pPr>
-        <w:pStyle w:val="BodyText"/>
-      </w:pPr>
-      <w:r>
-        <w:t xml:space="preserve">Consortium registration form</w:t>
-      </w:r>
-    </w:p>
-    <w:p>
-      <w:pPr>
-        <w:pStyle w:val="BodyText"/>
-      </w:pPr>
-      <w:r>
-        <w:t xml:space="preserve">Chaired by SCI; partner agencies delivering multi-purpose cash</w:t>
-      </w:r>
-    </w:p>
-    <w:p>
-      <w:pPr>
-        <w:pStyle w:val="BodyText"/>
-      </w:pPr>
-      <w:r>
-        <w:t xml:space="preserve">Household survey fields; vulnerability and consent</w:t>
-      </w:r>
-    </w:p>
-    <w:p>
-      <w:pPr>
-        <w:pStyle w:val="BodyText"/>
-      </w:pPr>
-      <w:r>
-        <w:t xml:space="preserve">Emergency Rapid Response Mechanism (ERRM)</w:t>
-      </w:r>
-    </w:p>
-    <w:p>
-      <w:pPr>
-        <w:pStyle w:val="BodyText"/>
-      </w:pPr>
-      <w:r>
-        <w:t xml:space="preserve">Consortium registration form</w:t>
-      </w:r>
-    </w:p>
-    <w:p>
-      <w:pPr>
-        <w:pStyle w:val="BodyText"/>
-      </w:pPr>
-      <w:r>
-        <w:t xml:space="preserve">NRC and DRC (rapid response in newly accessible / displaced locations)</w:t>
-      </w:r>
-    </w:p>
-    <w:p>
-      <w:pPr>
-        <w:pStyle w:val="BodyText"/>
-      </w:pPr>
-      <w:r>
-        <w:t xml:space="preserve">Biographic and minimum-viable Household survey fields</w:t>
-      </w:r>
-    </w:p>
-    <w:p>
-      <w:pPr>
-        <w:pStyle w:val="BodyText"/>
-      </w:pPr>
-      <w:r>
-        <w:t xml:space="preserve">UNHCR–WFP Minimum Core Assistance Delivery Dataset</w:t>
-      </w:r>
-    </w:p>
-    <w:p>
-      <w:pPr>
-        <w:pStyle w:val="BodyText"/>
-      </w:pPr>
-      <w:r>
-        <w:t xml:space="preserve">Policy / reference</w:t>
-      </w:r>
-    </w:p>
-    <w:p>
-      <w:pPr>
-        <w:pStyle w:val="BodyText"/>
-      </w:pPr>
-      <w:r>
-        <w:t xml:space="preserve">Joint UNHCR–WFP — minimum data items for delivering core assistance to affected populations</w:t>
-      </w:r>
-    </w:p>
-    <w:p>
-      <w:pPr>
-        <w:pStyle w:val="BodyText"/>
-      </w:pPr>
-      <w:r>
-        <w:t xml:space="preserve">Constraint on the SRF (must not contradict), rather than a source of fields</w:t>
-      </w:r>
-    </w:p>
-    <w:bookmarkEnd w:id="20"/>
-    <w:bookmarkStart w:id="21" w:name="iom"/>
-    <w:p>
-      <w:pPr>
-        <w:pStyle w:val="Heading2"/>
-      </w:pPr>
-      <w:r>
-        <w:t xml:space="preserve">3.1 IOM</w:t>
-      </w:r>
-    </w:p>
-    <w:p>
-      <w:pPr>
-        <w:pStyle w:val="FirstParagraph"/>
-      </w:pPr>
-      <w:r>
-        <w:t xml:space="preserve">IOM’s registration form in South Sudan are used across DTM and operational programmes. Along with WFP, they are the only two forms that include biometrics (fingerprint).</w:t>
-      </w:r>
-    </w:p>
-    <w:bookmarkEnd w:id="21"/>
-    <w:bookmarkStart w:id="22" w:name="wfp"/>
-    <w:p>
-      <w:pPr>
-        <w:pStyle w:val="Heading2"/>
-      </w:pPr>
-      <w:r>
-        <w:t xml:space="preserve">3.2 WFP</w:t>
-      </w:r>
-    </w:p>
-    <w:p>
-      <w:pPr>
-        <w:pStyle w:val="FirstParagraph"/>
-      </w:pPr>
-      <w:r>
-        <w:t xml:space="preserve">WFP’s registration form is comparable to IOM’s.</w:t>
-      </w:r>
-    </w:p>
-    <w:bookmarkEnd w:id="22"/>
-    <w:bookmarkStart w:id="23" w:name="cash-consortium"/>
-    <w:p>
-      <w:pPr>
-        <w:pStyle w:val="Heading2"/>
-      </w:pPr>
-      <w:r>
-        <w:t xml:space="preserve">3.3 Cash Consortium</w:t>
-      </w:r>
-    </w:p>
-    <w:p>
-      <w:pPr>
-        <w:pStyle w:val="FirstParagraph"/>
-      </w:pPr>
-      <w:r>
-        <w:t xml:space="preserve">The Cash Consortium (CC), chaired by Save the Children International (SCI), brings together a set of partners delivering multi-purpose cash assistance. Its shared registration form has been used by all Cash Consortium members.</w:t>
-      </w:r>
-    </w:p>
-    <w:bookmarkEnd w:id="23"/>
-    <w:bookmarkStart w:id="24" w:name="emergency-rapid-response-mechanism"/>
-    <w:p>
-      <w:pPr>
-        <w:pStyle w:val="Heading2"/>
-      </w:pPr>
-      <w:r>
-        <w:t xml:space="preserve">3.4 Emergency Rapid Response Mechanism</w:t>
-      </w:r>
-    </w:p>
-    <w:p>
-      <w:pPr>
-        <w:pStyle w:val="FirstParagraph"/>
-      </w:pPr>
-      <w:r>
-        <w:t xml:space="preserve">The Emergency Rapid Response Mechanism (ERRM) also has a standard form that has been in use by ERRM partners.</w:t>
-      </w:r>
-    </w:p>
-    <w:bookmarkEnd w:id="24"/>
-    <w:bookmarkStart w:id="29" w:name="Xc4dd5b62ecf71a5c8ce9e082dabbdaccc5f3ca1"/>
-    <w:p>
-      <w:pPr>
-        <w:pStyle w:val="Heading2"/>
-      </w:pPr>
-      <w:r>
-        <w:t xml:space="preserve">3.5 UNHCR–WFP Minimum Core Assistance Delivery Dataset for Affected Populations</w:t>
-      </w:r>
-    </w:p>
-    <w:p>
-      <w:pPr>
-        <w:pStyle w:val="FirstParagraph"/>
-      </w:pPr>
-      <w:r>
-        <w:t xml:space="preserve">The joint UNHCR–WFP Minimum Core Assistance Delivery Dataset for Affected Populations</w:t>
-      </w:r>
-      <w:r>
-        <w:rPr>
-          <w:rStyle w:val="FootnoteReference"/>
-        </w:rPr>
-        <w:footnoteReference w:id="25"/>
-      </w:r>
-      <w:r>
-        <w:t xml:space="preserve"> </w:t>
-      </w:r>
-      <w:r>
-        <w:t xml:space="preserve">sets out the minimum data items UNHCR and WFP capture when delivering core assistance, operationalising the joint UNHCR–WFP Common Cash Statement</w:t>
-      </w:r>
-      <w:r>
-        <w:rPr>
-          <w:rStyle w:val="FootnoteReference"/>
-        </w:rPr>
-        <w:footnoteReference w:id="27"/>
-      </w:r>
-      <w:r>
-        <w:t xml:space="preserve">. While most of its data fields are relevant to South Sudan and reflect fields already collected by most organization, some fields, such as bank account numbers, are less relevant for resource constrained contexts such as South Sudan.</w:t>
-      </w:r>
-    </w:p>
-    <w:bookmarkEnd w:id="29"/>
-    <w:bookmarkEnd w:id="30"/>
-    <w:bookmarkStart w:id="38" w:name="overlaps-in-data-points"/>
-    <w:p>
-      <w:pPr>
-        <w:pStyle w:val="Heading1"/>
-      </w:pPr>
-      <w:r>
-        <w:t xml:space="preserve">4. Overlaps in Data Points</w:t>
-      </w:r>
-    </w:p>
-    <w:p>
-      <w:pPr>
-        <w:pStyle w:val="FirstParagraph"/>
-      </w:pPr>
-      <w:r>
-        <w:t xml:space="preserve">Across the registration forms reviewed — IOM, WFP, Cash Consortium and ERRM, the following were observed:</w:t>
-      </w:r>
-    </w:p>
-    <w:p>
-      <w:pPr>
-        <w:numPr>
-          <w:ilvl w:val="0"/>
-          <w:numId w:val="1003"/>
-        </w:numPr>
-      </w:pPr>
-      <w:r>
-        <w:t xml:space="preserve">Only WFP and IOM gather either fingerprint biometrics or photos.</w:t>
-      </w:r>
-    </w:p>
-    <w:p>
-      <w:pPr>
-        <w:numPr>
-          <w:ilvl w:val="0"/>
-          <w:numId w:val="1003"/>
-        </w:numPr>
-      </w:pPr>
-      <w:r>
-        <w:t xml:space="preserve">Labels and choice lists varied among all forms. Examples include differing labels for the terms used on whether a person/household is displaced,refugee, host community etc. and the use of different age cohorts in different forms</w:t>
-      </w:r>
-    </w:p>
-    <w:p>
-      <w:pPr>
-        <w:numPr>
-          <w:ilvl w:val="0"/>
-          <w:numId w:val="1003"/>
-        </w:numPr>
-      </w:pPr>
-      <w:r>
-        <w:t xml:space="preserve">Structures of the forms differed considerably. Some such as the ERRM form used a summary format to capture household composition and characteristics, whereas the IOM form gathers information for each individual household member.</w:t>
-      </w:r>
-    </w:p>
-    <w:p>
-      <w:pPr>
-        <w:pStyle w:val="CaptionedFigure"/>
       </w:pPr>
       <w:r>
         <w:drawing>
           <wp:inline>
-            <wp:extent cx="5334000" cy="13559407"/>
+            <wp:extent cx="5334000" cy="4085448"/>
             <wp:effectExtent b="0" l="0" r="0" t="0"/>
-            <wp:docPr descr="Overlapping data points" title="" id="32" name="Picture"/>
+            <wp:docPr descr="" title="" id="21" name="Picture"/>
             <a:graphic>
               <a:graphicData uri="http://schemas.openxmlformats.org/drawingml/2006/picture">
                 <pic:pic>
                   <pic:nvPicPr>
-                    <pic:cNvPr descr="./figures/data_point_overlap.svg" id="33" name="Picture"/>
+                    <pic:cNvPr descr="_tables/tbl-sources.png" id="22" name="Picture"/>
                     <pic:cNvPicPr>
                       <a:picLocks noChangeArrowheads="1" noChangeAspect="1"/>
                     </pic:cNvPicPr>
                   </pic:nvPicPr>
                   <pic:blipFill>
-                    <a:blip r:embed="rId34">
+                    <a:blip r:embed="rId20"/>
+                    <a:stretch>
+                      <a:fillRect/>
+                    </a:stretch>
+                  </pic:blipFill>
+                  <pic:spPr bwMode="auto">
+                    <a:xfrm>
+                      <a:off x="0" y="0"/>
+                      <a:ext cx="5334000" cy="4085448"/>
+                    </a:xfrm>
+                    <a:prstGeom prst="rect">
+                      <a:avLst/>
+                    </a:prstGeom>
+                    <a:noFill/>
+                    <a:ln w="9525">
+                      <a:noFill/>
+                      <a:headEnd/>
+                      <a:tailEnd/>
+                    </a:ln>
+                  </pic:spPr>
+                </pic:pic>
+              </a:graphicData>
+            </a:graphic>
+          </wp:inline>
+        </w:drawing>
+      </w:r>
+    </w:p>
+    <w:bookmarkStart w:id="23" w:name="iom"/>
+    <w:p>
+      <w:pPr>
+        <w:pStyle w:val="Heading2"/>
+      </w:pPr>
+      <w:r>
+        <w:t xml:space="preserve">3.1 IOM</w:t>
+      </w:r>
+    </w:p>
+    <w:p>
+      <w:pPr>
+        <w:pStyle w:val="FirstParagraph"/>
+      </w:pPr>
+      <w:r>
+        <w:t xml:space="preserve">IOM’s registration form in South Sudan are used across DTM and operational programmes. Along with WFP, they are the only two forms that include biometrics (fingerprint).</w:t>
+      </w:r>
+    </w:p>
+    <w:bookmarkEnd w:id="23"/>
+    <w:bookmarkStart w:id="24" w:name="wfp"/>
+    <w:p>
+      <w:pPr>
+        <w:pStyle w:val="Heading2"/>
+      </w:pPr>
+      <w:r>
+        <w:t xml:space="preserve">3.2 WFP</w:t>
+      </w:r>
+    </w:p>
+    <w:p>
+      <w:pPr>
+        <w:pStyle w:val="FirstParagraph"/>
+      </w:pPr>
+      <w:r>
+        <w:t xml:space="preserve">WFP’s registration form is comparable to IOM’s.</w:t>
+      </w:r>
+    </w:p>
+    <w:bookmarkEnd w:id="24"/>
+    <w:bookmarkStart w:id="25" w:name="cash-consortium"/>
+    <w:p>
+      <w:pPr>
+        <w:pStyle w:val="Heading2"/>
+      </w:pPr>
+      <w:r>
+        <w:t xml:space="preserve">3.3 Cash Consortium</w:t>
+      </w:r>
+    </w:p>
+    <w:p>
+      <w:pPr>
+        <w:pStyle w:val="FirstParagraph"/>
+      </w:pPr>
+      <w:r>
+        <w:t xml:space="preserve">The Cash Consortium (CC), chaired by Save the Children International (SCI), brings together a set of partners delivering multi-purpose cash assistance. Its shared registration form has been used by all Cash Consortium members.</w:t>
+      </w:r>
+    </w:p>
+    <w:bookmarkEnd w:id="25"/>
+    <w:bookmarkStart w:id="26" w:name="emergency-rapid-response-mechanism"/>
+    <w:p>
+      <w:pPr>
+        <w:pStyle w:val="Heading2"/>
+      </w:pPr>
+      <w:r>
+        <w:t xml:space="preserve">3.4 Emergency Rapid Response Mechanism</w:t>
+      </w:r>
+    </w:p>
+    <w:p>
+      <w:pPr>
+        <w:pStyle w:val="FirstParagraph"/>
+      </w:pPr>
+      <w:r>
+        <w:t xml:space="preserve">The Emergency Rapid Response Mechanism (ERRM) also has a standard form that has been in use by ERRM partners.</w:t>
+      </w:r>
+    </w:p>
+    <w:bookmarkEnd w:id="26"/>
+    <w:bookmarkStart w:id="31" w:name="Xc4dd5b62ecf71a5c8ce9e082dabbdaccc5f3ca1"/>
+    <w:p>
+      <w:pPr>
+        <w:pStyle w:val="Heading2"/>
+      </w:pPr>
+      <w:r>
+        <w:t xml:space="preserve">3.5 UNHCR–WFP Minimum Core Assistance Delivery Dataset for Affected Populations</w:t>
+      </w:r>
+    </w:p>
+    <w:p>
+      <w:pPr>
+        <w:pStyle w:val="FirstParagraph"/>
+      </w:pPr>
+      <w:r>
+        <w:t xml:space="preserve">The joint UNHCR–WFP Minimum Core Assistance Delivery Dataset for Affected Populations</w:t>
+      </w:r>
+      <w:r>
+        <w:rPr>
+          <w:rStyle w:val="FootnoteReference"/>
+        </w:rPr>
+        <w:footnoteReference w:id="27"/>
+      </w:r>
+      <w:r>
+        <w:t xml:space="preserve"> </w:t>
+      </w:r>
+      <w:r>
+        <w:t xml:space="preserve">sets out the minimum data items UNHCR and WFP capture when delivering core assistance, operationalising the joint UNHCR–WFP Common Cash Statement</w:t>
+      </w:r>
+      <w:r>
+        <w:rPr>
+          <w:rStyle w:val="FootnoteReference"/>
+        </w:rPr>
+        <w:footnoteReference w:id="29"/>
+      </w:r>
+      <w:r>
+        <w:t xml:space="preserve">. While most of its data fields are relevant to South Sudan and reflect fields already collected by most organization, some fields, such as bank account numbers, are less relevant for resource constrained contexts such as South Sudan.</w:t>
+      </w:r>
+    </w:p>
+    <w:bookmarkEnd w:id="31"/>
+    <w:bookmarkEnd w:id="32"/>
+    <w:bookmarkStart w:id="40" w:name="overlaps-in-data-points"/>
+    <w:p>
+      <w:pPr>
+        <w:pStyle w:val="Heading1"/>
+      </w:pPr>
+      <w:r>
+        <w:t xml:space="preserve">4. Overlaps in Data Points</w:t>
+      </w:r>
+    </w:p>
+    <w:p>
+      <w:pPr>
+        <w:pStyle w:val="FirstParagraph"/>
+      </w:pPr>
+      <w:r>
+        <w:t xml:space="preserve">Across the registration forms reviewed — IOM, WFP, Cash Consortium and ERRM, the following were observed:</w:t>
+      </w:r>
+    </w:p>
+    <w:p>
+      <w:pPr>
+        <w:numPr>
+          <w:ilvl w:val="0"/>
+          <w:numId w:val="1003"/>
+        </w:numPr>
+      </w:pPr>
+      <w:r>
+        <w:t xml:space="preserve">Only WFP and IOM gather either fingerprint biometrics or photos.</w:t>
+      </w:r>
+    </w:p>
+    <w:p>
+      <w:pPr>
+        <w:numPr>
+          <w:ilvl w:val="0"/>
+          <w:numId w:val="1003"/>
+        </w:numPr>
+      </w:pPr>
+      <w:r>
+        <w:t xml:space="preserve">Labels and choice lists varied among all forms. Examples include differing labels for the terms used on whether a person/household is displaced,refugee, host community etc. and the use of different age cohorts in different forms</w:t>
+      </w:r>
+    </w:p>
+    <w:p>
+      <w:pPr>
+        <w:numPr>
+          <w:ilvl w:val="0"/>
+          <w:numId w:val="1003"/>
+        </w:numPr>
+      </w:pPr>
+      <w:r>
+        <w:t xml:space="preserve">Structures of the forms differed considerably. Some such as the ERRM form used a summary format to capture household composition and characteristics, whereas the IOM form gathers information for each individual household member.</w:t>
+      </w:r>
+    </w:p>
+    <w:p>
+      <w:pPr>
+        <w:pStyle w:val="CaptionedFigure"/>
+      </w:pPr>
+      <w:r>
+        <w:drawing>
+          <wp:inline>
+            <wp:extent cx="5334000" cy="13559407"/>
+            <wp:effectExtent b="0" l="0" r="0" t="0"/>
+            <wp:docPr descr="Overlapping data points" title="" id="34" name="Picture"/>
+            <a:graphic>
+              <a:graphicData uri="http://schemas.openxmlformats.org/drawingml/2006/picture">
+                <pic:pic>
+                  <pic:nvPicPr>
+                    <pic:cNvPr descr="./figures/data_point_overlap.svg" id="35" name="Picture"/>
+                    <pic:cNvPicPr>
+                      <a:picLocks noChangeArrowheads="1" noChangeAspect="1"/>
+                    </pic:cNvPicPr>
+                  </pic:nvPicPr>
+                  <pic:blipFill>
+                    <a:blip r:embed="rId36">
                       <a:extLst>
                         <a:ext uri="{28A0092B-C50C-407E-A947-70E740481C1C}">
                           <a14:useLocalDpi xmlns:a14="http://schemas.microsoft.com/office/drawing/2010/main" val="0"/>
                         </a:ext>
                         <a:ext uri="{96DAC541-7B7A-43D3-8B79-37D633B846F1}">
-                          <asvg:svgBlip xmlns:asvg="http://schemas.microsoft.com/office/drawing/2016/SVG/main" r:embed="rId31"/>
+                          <asvg:svgBlip xmlns:asvg="http://schemas.microsoft.com/office/drawing/2016/SVG/main" r:embed="rId33"/>
                         </a:ext>
                       </a:extLst>
                     </a:blip>
@@ -937,18 +774,18 @@
                 <wp:inline>
                   <wp:extent cx="152400" cy="152400"/>
                   <wp:effectExtent b="0" l="0" r="0" t="0"/>
-                  <wp:docPr descr="" title="" id="36" name="Picture"/>
+                  <wp:docPr descr="" title="" id="38" name="Picture"/>
                   <a:graphic>
                     <a:graphicData uri="http://schemas.openxmlformats.org/drawingml/2006/picture">
                       <pic:pic>
                         <pic:nvPicPr>
-                          <pic:cNvPr descr="/Applications/quarto/share/formats/docx/note.png" id="37" name="Picture"/>
+                          <pic:cNvPr descr="/Applications/quarto/share/formats/docx/note.png" id="39" name="Picture"/>
                           <pic:cNvPicPr>
                             <a:picLocks noChangeArrowheads="1" noChangeAspect="1"/>
                           </pic:cNvPicPr>
                         </pic:nvPicPr>
                         <pic:blipFill>
-                          <a:blip r:embed="rId35"/>
+                          <a:blip r:embed="rId37"/>
                           <a:stretch>
                             <a:fillRect/>
                           </a:stretch>
@@ -1012,8 +849,8 @@
         </w:tc>
       </w:tr>
     </w:tbl>
-    <w:bookmarkEnd w:id="38"/>
-    <w:bookmarkStart w:id="44" w:name="categorization-of-data-points"/>
+    <w:bookmarkEnd w:id="40"/>
+    <w:bookmarkStart w:id="48" w:name="categorization-of-data-points"/>
     <w:p>
       <w:pPr>
         <w:pStyle w:val="Heading1"/>
@@ -1022,7 +859,7 @@
         <w:t xml:space="preserve">5. Categorization of Data Points</w:t>
       </w:r>
     </w:p>
-    <w:bookmarkStart w:id="40" w:name="proposal"/>
+    <w:bookmarkStart w:id="44" w:name="proposal"/>
     <w:p>
       <w:pPr>
         <w:pStyle w:val="Heading2"/>
@@ -1052,152 +889,53 @@
         <w:t xml:space="preserve">. Categories are logical grouping of the different types of data fields collected or generated during registration and associated workflows.</w:t>
       </w:r>
     </w:p>
-    <w:bookmarkStart w:id="39" w:name="gt-categories"/>
     <w:p>
       <w:pPr>
         <w:pStyle w:val="BodyText"/>
       </w:pPr>
       <w:r>
-        <w:t xml:space="preserve">Categories</w:t>
-      </w:r>
-    </w:p>
-    <w:p>
-      <w:pPr>
-        <w:pStyle w:val="BodyText"/>
-      </w:pPr>
-      <w:r>
-        <w:t xml:space="preserve">The category each SRF field is grouped under</w:t>
-      </w:r>
-    </w:p>
-    <w:p>
-      <w:pPr>
-        <w:pStyle w:val="BodyText"/>
-      </w:pPr>
-      <w:r>
-        <w:t xml:space="preserve">Category</w:t>
-      </w:r>
-    </w:p>
-    <w:p>
-      <w:pPr>
-        <w:pStyle w:val="BodyText"/>
-      </w:pPr>
-      <w:r>
-        <w:t xml:space="preserve">What it covers</w:t>
-      </w:r>
-    </w:p>
-    <w:p>
-      <w:pPr>
-        <w:pStyle w:val="BodyText"/>
-      </w:pPr>
-      <w:r>
-        <w:t xml:space="preserve">Consent</w:t>
-      </w:r>
-    </w:p>
-    <w:p>
-      <w:pPr>
-        <w:pStyle w:val="BodyText"/>
-      </w:pPr>
-      <w:r>
-        <w:t xml:space="preserve">Informed consent to collect, use, share, and refer case data.</w:t>
-      </w:r>
-    </w:p>
-    <w:p>
-      <w:pPr>
-        <w:pStyle w:val="BodyText"/>
-      </w:pPr>
-      <w:r>
-        <w:t xml:space="preserve">Metadata</w:t>
-      </w:r>
-    </w:p>
-    <w:p>
-      <w:pPr>
-        <w:pStyle w:val="BodyText"/>
-      </w:pPr>
-      <w:r>
-        <w:t xml:space="preserve">Form, project and process data: registration date, enumerator, IDs, source.</w:t>
-      </w:r>
-    </w:p>
-    <w:p>
-      <w:pPr>
-        <w:pStyle w:val="BodyText"/>
-      </w:pPr>
-      <w:r>
-        <w:t xml:space="preserve">Biographic</w:t>
-      </w:r>
-    </w:p>
-    <w:p>
-      <w:pPr>
-        <w:pStyle w:val="BodyText"/>
-      </w:pPr>
-      <w:r>
-        <w:t xml:space="preserve">Person and place data: names, sex, DOB, location, nationality, civil ID.</w:t>
-      </w:r>
-    </w:p>
-    <w:p>
-      <w:pPr>
-        <w:pStyle w:val="BodyText"/>
-      </w:pPr>
-      <w:r>
-        <w:t xml:space="preserve">Household survey</w:t>
-      </w:r>
-    </w:p>
-    <w:p>
-      <w:pPr>
-        <w:pStyle w:val="BodyText"/>
-      </w:pPr>
-      <w:r>
-        <w:t xml:space="preserve">Household-level questions: size, sex-age cohort, disability screen, drivers of displacement.</w:t>
-      </w:r>
-    </w:p>
-    <w:p>
-      <w:pPr>
-        <w:pStyle w:val="BodyText"/>
-      </w:pPr>
-      <w:r>
-        <w:t xml:space="preserve">Individual survey</w:t>
-      </w:r>
-    </w:p>
-    <w:p>
-      <w:pPr>
-        <w:pStyle w:val="BodyText"/>
-      </w:pPr>
-      <w:r>
-        <w:t xml:space="preserve">Individual-level questions: disability / accessibility, special needs.</w:t>
-      </w:r>
-    </w:p>
-    <w:p>
-      <w:pPr>
-        <w:pStyle w:val="BodyText"/>
-      </w:pPr>
-      <w:r>
-        <w:t xml:space="preserve">Biometrics</w:t>
-      </w:r>
-    </w:p>
-    <w:p>
-      <w:pPr>
-        <w:pStyle w:val="BodyText"/>
-      </w:pPr>
-      <w:r>
-        <w:t xml:space="preserve">Fingerprints and photos used for identity matching.</w:t>
-      </w:r>
-    </w:p>
-    <w:p>
-      <w:pPr>
-        <w:pStyle w:val="BodyText"/>
-      </w:pPr>
-      <w:r>
-        <w:t xml:space="preserve">Other</w:t>
-      </w:r>
-    </w:p>
-    <w:p>
-      <w:pPr>
-        <w:pStyle w:val="BodyText"/>
-      </w:pPr>
-      <w:r>
-        <w:t xml:space="preserve">Payment instrument data (account / wallet, expiry).</w:t>
-      </w:r>
-    </w:p>
-    <w:bookmarkEnd w:id="39"/>
+        <w:drawing>
+          <wp:inline>
+            <wp:extent cx="5334000" cy="3073964"/>
+            <wp:effectExtent b="0" l="0" r="0" t="0"/>
+            <wp:docPr descr="" title="" id="42" name="Picture"/>
+            <a:graphic>
+              <a:graphicData uri="http://schemas.openxmlformats.org/drawingml/2006/picture">
+                <pic:pic>
+                  <pic:nvPicPr>
+                    <pic:cNvPr descr="_tables/tbl-categories.png" id="43" name="Picture"/>
+                    <pic:cNvPicPr>
+                      <a:picLocks noChangeArrowheads="1" noChangeAspect="1"/>
+                    </pic:cNvPicPr>
+                  </pic:nvPicPr>
+                  <pic:blipFill>
+                    <a:blip r:embed="rId41"/>
+                    <a:stretch>
+                      <a:fillRect/>
+                    </a:stretch>
+                  </pic:blipFill>
+                  <pic:spPr bwMode="auto">
+                    <a:xfrm>
+                      <a:off x="0" y="0"/>
+                      <a:ext cx="5334000" cy="3073964"/>
+                    </a:xfrm>
+                    <a:prstGeom prst="rect">
+                      <a:avLst/>
+                    </a:prstGeom>
+                    <a:noFill/>
+                    <a:ln w="9525">
+                      <a:noFill/>
+                      <a:headEnd/>
+                      <a:tailEnd/>
+                    </a:ln>
+                  </pic:spPr>
+                </pic:pic>
+              </a:graphicData>
+            </a:graphic>
+          </wp:inline>
+        </w:drawing>
+      </w:r>
+    </w:p>
     <w:p>
       <w:pPr>
         <w:pStyle w:val="BodyText"/>
@@ -1238,8 +976,8 @@
         <w:t xml:space="preserve">covers both the household address (household level) and the head-of-household name (individual level).</w:t>
       </w:r>
     </w:p>
-    <w:bookmarkEnd w:id="40"/>
-    <w:bookmarkStart w:id="43" w:name="alternatives"/>
+    <w:bookmarkEnd w:id="44"/>
+    <w:bookmarkStart w:id="47" w:name="alternatives"/>
     <w:p>
       <w:pPr>
         <w:pStyle w:val="Heading2"/>
@@ -1339,18 +1077,18 @@
                 <wp:inline>
                   <wp:extent cx="152400" cy="152400"/>
                   <wp:effectExtent b="0" l="0" r="0" t="0"/>
-                  <wp:docPr descr="" title="" id="41" name="Picture"/>
+                  <wp:docPr descr="" title="" id="45" name="Picture"/>
                   <a:graphic>
                     <a:graphicData uri="http://schemas.openxmlformats.org/drawingml/2006/picture">
                       <pic:pic>
                         <pic:nvPicPr>
-                          <pic:cNvPr descr="/Applications/quarto/share/formats/docx/note.png" id="42" name="Picture"/>
+                          <pic:cNvPr descr="/Applications/quarto/share/formats/docx/note.png" id="46" name="Picture"/>
                           <pic:cNvPicPr>
                             <a:picLocks noChangeArrowheads="1" noChangeAspect="1"/>
                           </pic:cNvPicPr>
                         </pic:nvPicPr>
                         <pic:blipFill>
-                          <a:blip r:embed="rId35"/>
+                          <a:blip r:embed="rId37"/>
                           <a:stretch>
                             <a:fillRect/>
                           </a:stretch>
@@ -1472,9 +1210,9 @@
         </w:tc>
       </w:tr>
     </w:tbl>
-    <w:bookmarkEnd w:id="43"/>
-    <w:bookmarkEnd w:id="44"/>
-    <w:bookmarkStart w:id="50" w:name="core-optional"/>
+    <w:bookmarkEnd w:id="47"/>
+    <w:bookmarkEnd w:id="48"/>
+    <w:bookmarkStart w:id="56" w:name="core-optional"/>
     <w:p>
       <w:pPr>
         <w:pStyle w:val="Heading1"/>
@@ -1483,7 +1221,7 @@
         <w:t xml:space="preserve">6. Core &amp; Optional</w:t>
       </w:r>
     </w:p>
-    <w:bookmarkStart w:id="46" w:name="proposal-1"/>
+    <w:bookmarkStart w:id="52" w:name="proposal-1"/>
     <w:p>
       <w:pPr>
         <w:pStyle w:val="Heading2"/>
@@ -1542,96 +1280,53 @@
         <w:t xml:space="preserve">, not about whether a single organization or sector happens to find the field useful.</w:t>
       </w:r>
     </w:p>
-    <w:bookmarkStart w:id="45" w:name="gt-classification"/>
     <w:p>
       <w:pPr>
         <w:pStyle w:val="BodyText"/>
       </w:pPr>
       <w:r>
-        <w:t xml:space="preserve">Field classification</w:t>
-      </w:r>
-    </w:p>
-    <w:p>
-      <w:pPr>
-        <w:pStyle w:val="BodyText"/>
-      </w:pPr>
-      <w:r>
-        <w:t xml:space="preserve">Two tiers determine whether a field is shown by default</w:t>
-      </w:r>
-    </w:p>
-    <w:p>
-      <w:pPr>
-        <w:pStyle w:val="BodyText"/>
-      </w:pPr>
-      <w:r>
-        <w:t xml:space="preserve">Class</w:t>
-      </w:r>
-    </w:p>
-    <w:p>
-      <w:pPr>
-        <w:pStyle w:val="BodyText"/>
-      </w:pPr>
-      <w:r>
-        <w:t xml:space="preserve">Meaning</w:t>
-      </w:r>
-    </w:p>
-    <w:p>
-      <w:pPr>
-        <w:pStyle w:val="BodyText"/>
-      </w:pPr>
-      <w:r>
-        <w:t xml:space="preserve">Behaviour on the form</w:t>
-      </w:r>
-    </w:p>
-    <w:p>
-      <w:pPr>
-        <w:pStyle w:val="BodyText"/>
-      </w:pPr>
-      <w:r>
-        <w:t xml:space="preserve">Core</w:t>
-      </w:r>
-    </w:p>
-    <w:p>
-      <w:pPr>
-        <w:pStyle w:val="BodyText"/>
-      </w:pPr>
-      <w:r>
-        <w:t xml:space="preserve">Required for the SRF to do its job: identify the household, enable referral, and support deduplication.</w:t>
-      </w:r>
-    </w:p>
-    <w:p>
-      <w:pPr>
-        <w:pStyle w:val="BodyText"/>
-      </w:pPr>
-      <w:r>
-        <w:t xml:space="preserve">Always shown. Cannot be skipped.</w:t>
-      </w:r>
-    </w:p>
-    <w:p>
-      <w:pPr>
-        <w:pStyle w:val="BodyText"/>
-      </w:pPr>
-      <w:r>
-        <w:t xml:space="preserve">Optional</w:t>
-      </w:r>
-    </w:p>
-    <w:p>
-      <w:pPr>
-        <w:pStyle w:val="BodyText"/>
-      </w:pPr>
-      <w:r>
-        <w:t xml:space="preserve">Conditional, programme-specific, or sensitive. Only collected when the operation actually needs it.</w:t>
-      </w:r>
-    </w:p>
-    <w:p>
-      <w:pPr>
-        <w:pStyle w:val="BodyText"/>
-      </w:pPr>
-      <w:r>
-        <w:t xml:space="preserve">Hidden by default. Switched on per programme / per modality.</w:t>
-      </w:r>
-    </w:p>
-    <w:bookmarkEnd w:id="45"/>
+        <w:drawing>
+          <wp:inline>
+            <wp:extent cx="5334000" cy="1833315"/>
+            <wp:effectExtent b="0" l="0" r="0" t="0"/>
+            <wp:docPr descr="" title="" id="50" name="Picture"/>
+            <a:graphic>
+              <a:graphicData uri="http://schemas.openxmlformats.org/drawingml/2006/picture">
+                <pic:pic>
+                  <pic:nvPicPr>
+                    <pic:cNvPr descr="_tables/tbl-classification.png" id="51" name="Picture"/>
+                    <pic:cNvPicPr>
+                      <a:picLocks noChangeArrowheads="1" noChangeAspect="1"/>
+                    </pic:cNvPicPr>
+                  </pic:nvPicPr>
+                  <pic:blipFill>
+                    <a:blip r:embed="rId49"/>
+                    <a:stretch>
+                      <a:fillRect/>
+                    </a:stretch>
+                  </pic:blipFill>
+                  <pic:spPr bwMode="auto">
+                    <a:xfrm>
+                      <a:off x="0" y="0"/>
+                      <a:ext cx="5334000" cy="1833315"/>
+                    </a:xfrm>
+                    <a:prstGeom prst="rect">
+                      <a:avLst/>
+                    </a:prstGeom>
+                    <a:noFill/>
+                    <a:ln w="9525">
+                      <a:noFill/>
+                      <a:headEnd/>
+                      <a:tailEnd/>
+                    </a:ln>
+                  </pic:spPr>
+                </pic:pic>
+              </a:graphicData>
+            </a:graphic>
+          </wp:inline>
+        </w:drawing>
+      </w:r>
+    </w:p>
     <w:p>
       <w:pPr>
         <w:pStyle w:val="BodyText"/>
@@ -1650,8 +1345,8 @@
         <w:t xml:space="preserve">Optional fields are simply not part of the agreed shared minimum. Agencies can keep collecting them internally.</w:t>
       </w:r>
     </w:p>
-    <w:bookmarkEnd w:id="46"/>
-    <w:bookmarkStart w:id="49" w:name="alternatives-1"/>
+    <w:bookmarkEnd w:id="52"/>
+    <w:bookmarkStart w:id="55" w:name="alternatives-1"/>
     <w:p>
       <w:pPr>
         <w:pStyle w:val="Heading2"/>
@@ -1819,18 +1514,18 @@
                 <wp:inline>
                   <wp:extent cx="152400" cy="152400"/>
                   <wp:effectExtent b="0" l="0" r="0" t="0"/>
-                  <wp:docPr descr="" title="" id="47" name="Picture"/>
+                  <wp:docPr descr="" title="" id="53" name="Picture"/>
                   <a:graphic>
                     <a:graphicData uri="http://schemas.openxmlformats.org/drawingml/2006/picture">
                       <pic:pic>
                         <pic:nvPicPr>
-                          <pic:cNvPr descr="/Applications/quarto/share/formats/docx/note.png" id="48" name="Picture"/>
+                          <pic:cNvPr descr="/Applications/quarto/share/formats/docx/note.png" id="54" name="Picture"/>
                           <pic:cNvPicPr>
                             <a:picLocks noChangeArrowheads="1" noChangeAspect="1"/>
                           </pic:cNvPicPr>
                         </pic:nvPicPr>
                         <pic:blipFill>
-                          <a:blip r:embed="rId35"/>
+                          <a:blip r:embed="rId37"/>
                           <a:stretch>
                             <a:fillRect/>
                           </a:stretch>
@@ -1910,9 +1605,9 @@
         </w:tc>
       </w:tr>
     </w:tbl>
-    <w:bookmarkEnd w:id="49"/>
-    <w:bookmarkEnd w:id="50"/>
-    <w:bookmarkStart w:id="56" w:name="single-registration-form"/>
+    <w:bookmarkEnd w:id="55"/>
+    <w:bookmarkEnd w:id="56"/>
+    <w:bookmarkStart w:id="70" w:name="single-registration-form"/>
     <w:p>
       <w:pPr>
         <w:pStyle w:val="Heading1"/>
@@ -2233,13 +1928,51 @@
         <w:t xml:space="preserve">The Core-only view is the smallest unit of agreement the SRF needs in order to function. Comments are particularly welcome on whether any field currently classed as Core should be demoted, or whether any Optional field is in fact required for deduplication or referral and should be promoted to Core.</w:t>
       </w:r>
     </w:p>
-    <w:bookmarkStart w:id="51" w:name="gt-srf-fields"/>
     <w:p>
       <w:pPr>
         <w:pStyle w:val="BodyText"/>
       </w:pPr>
       <w:r>
-        <w:t xml:space="preserve">Draft Single Registration Form — data fields</w:t>
+        <w:drawing>
+          <wp:inline>
+            <wp:extent cx="5334000" cy="3742606"/>
+            <wp:effectExtent b="0" l="0" r="0" t="0"/>
+            <wp:docPr descr="" title="" id="58" name="Picture"/>
+            <a:graphic>
+              <a:graphicData uri="http://schemas.openxmlformats.org/drawingml/2006/picture">
+                <pic:pic>
+                  <pic:nvPicPr>
+                    <pic:cNvPr descr="_tables/tbl-srf-fields-part1.png" id="59" name="Picture"/>
+                    <pic:cNvPicPr>
+                      <a:picLocks noChangeArrowheads="1" noChangeAspect="1"/>
+                    </pic:cNvPicPr>
+                  </pic:nvPicPr>
+                  <pic:blipFill>
+                    <a:blip r:embed="rId57"/>
+                    <a:stretch>
+                      <a:fillRect/>
+                    </a:stretch>
+                  </pic:blipFill>
+                  <pic:spPr bwMode="auto">
+                    <a:xfrm>
+                      <a:off x="0" y="0"/>
+                      <a:ext cx="5334000" cy="3742606"/>
+                    </a:xfrm>
+                    <a:prstGeom prst="rect">
+                      <a:avLst/>
+                    </a:prstGeom>
+                    <a:noFill/>
+                    <a:ln w="9525">
+                      <a:noFill/>
+                      <a:headEnd/>
+                      <a:tailEnd/>
+                    </a:ln>
+                  </pic:spPr>
+                </pic:pic>
+              </a:graphicData>
+            </a:graphic>
+          </wp:inline>
+        </w:drawing>
       </w:r>
     </w:p>
     <w:p>
@@ -2247,7 +1980,46 @@
         <w:pStyle w:val="BodyText"/>
       </w:pPr>
       <w:r>
-        <w:t xml:space="preserve">All 46 fields proposed for the Single Registration Form, grouped by category</w:t>
+        <w:drawing>
+          <wp:inline>
+            <wp:extent cx="5334000" cy="5384320"/>
+            <wp:effectExtent b="0" l="0" r="0" t="0"/>
+            <wp:docPr descr="" title="" id="61" name="Picture"/>
+            <a:graphic>
+              <a:graphicData uri="http://schemas.openxmlformats.org/drawingml/2006/picture">
+                <pic:pic>
+                  <pic:nvPicPr>
+                    <pic:cNvPr descr="_tables/tbl-srf-fields-part2.png" id="62" name="Picture"/>
+                    <pic:cNvPicPr>
+                      <a:picLocks noChangeArrowheads="1" noChangeAspect="1"/>
+                    </pic:cNvPicPr>
+                  </pic:nvPicPr>
+                  <pic:blipFill>
+                    <a:blip r:embed="rId60"/>
+                    <a:stretch>
+                      <a:fillRect/>
+                    </a:stretch>
+                  </pic:blipFill>
+                  <pic:spPr bwMode="auto">
+                    <a:xfrm>
+                      <a:off x="0" y="0"/>
+                      <a:ext cx="5334000" cy="5384320"/>
+                    </a:xfrm>
+                    <a:prstGeom prst="rect">
+                      <a:avLst/>
+                    </a:prstGeom>
+                    <a:noFill/>
+                    <a:ln w="9525">
+                      <a:noFill/>
+                      <a:headEnd/>
+                      <a:tailEnd/>
+                    </a:ln>
+                  </pic:spPr>
+                </pic:pic>
+              </a:graphicData>
+            </a:graphic>
+          </wp:inline>
+        </w:drawing>
       </w:r>
     </w:p>
     <w:p>
@@ -2255,1956 +2027,48 @@
         <w:pStyle w:val="BodyText"/>
       </w:pPr>
       <w:r>
-        <w:t xml:space="preserve">Field ID</w:t>
-      </w:r>
-    </w:p>
-    <w:p>
-      <w:pPr>
-        <w:pStyle w:val="BodyText"/>
-      </w:pPr>
-      <w:r>
-        <w:t xml:space="preserve">Field label</w:t>
-      </w:r>
-    </w:p>
-    <w:p>
-      <w:pPr>
-        <w:pStyle w:val="BodyText"/>
-      </w:pPr>
-      <w:r>
-        <w:t xml:space="preserve">Record level</w:t>
-      </w:r>
-    </w:p>
-    <w:p>
-      <w:pPr>
-        <w:pStyle w:val="BodyText"/>
-      </w:pPr>
-      <w:r>
-        <w:t xml:space="preserve">Core / Optional</w:t>
-      </w:r>
-    </w:p>
-    <w:p>
-      <w:pPr>
-        <w:pStyle w:val="BodyText"/>
-      </w:pPr>
-      <w:r>
-        <w:t xml:space="preserve">Sources</w:t>
-      </w:r>
-    </w:p>
-    <w:p>
-      <w:pPr>
-        <w:pStyle w:val="BodyText"/>
-      </w:pPr>
-      <w:r>
-        <w:t xml:space="preserve">Consent</w:t>
-      </w:r>
-    </w:p>
-    <w:p>
-      <w:pPr>
-        <w:pStyle w:val="BodyText"/>
-      </w:pPr>
-      <w:r>
-        <w:t xml:space="preserve">C1</w:t>
-      </w:r>
-    </w:p>
-    <w:p>
-      <w:pPr>
-        <w:pStyle w:val="BodyText"/>
-      </w:pPr>
-      <w:r>
-        <w:t xml:space="preserve">Informed consent to collect, use, share, and refer case data</w:t>
-      </w:r>
-    </w:p>
-    <w:p>
-      <w:pPr>
-        <w:pStyle w:val="BodyText"/>
-      </w:pPr>
-      <w:r>
-        <w:t xml:space="preserve">—</w:t>
-      </w:r>
-    </w:p>
-    <w:p>
-      <w:pPr>
-        <w:pStyle w:val="BodyText"/>
-      </w:pPr>
-      <w:r>
-        <w:t xml:space="preserve">Core</w:t>
-      </w:r>
-    </w:p>
-    <w:p>
-      <w:pPr>
-        <w:pStyle w:val="BodyText"/>
-      </w:pPr>
-      <w:r>
-        <w:t xml:space="preserve">Inter-agency + Cash Consortium + IOM</w:t>
-      </w:r>
-    </w:p>
-    <w:p>
-      <w:pPr>
-        <w:pStyle w:val="BodyText"/>
-      </w:pPr>
-      <w:r>
-        <w:t xml:space="preserve">Metadata</w:t>
-      </w:r>
-    </w:p>
-    <w:p>
-      <w:pPr>
-        <w:pStyle w:val="BodyText"/>
-      </w:pPr>
-      <w:r>
-        <w:t xml:space="preserve">M1</w:t>
-      </w:r>
-    </w:p>
-    <w:p>
-      <w:pPr>
-        <w:pStyle w:val="BodyText"/>
-      </w:pPr>
-      <w:r>
-        <w:t xml:space="preserve">Project / assistance programme / referring organisation</w:t>
-      </w:r>
-    </w:p>
-    <w:p>
-      <w:pPr>
-        <w:pStyle w:val="BodyText"/>
-      </w:pPr>
-      <w:r>
-        <w:t xml:space="preserve">—</w:t>
-      </w:r>
-    </w:p>
-    <w:p>
-      <w:pPr>
-        <w:pStyle w:val="BodyText"/>
-      </w:pPr>
-      <w:r>
-        <w:t xml:space="preserve">Core</w:t>
-      </w:r>
-    </w:p>
-    <w:p>
-      <w:pPr>
-        <w:pStyle w:val="BodyText"/>
-      </w:pPr>
-      <w:r>
-        <w:t xml:space="preserve">Cash Consortium + ERRM + Inter-agency metadata</w:t>
-      </w:r>
-    </w:p>
-    <w:p>
-      <w:pPr>
-        <w:pStyle w:val="BodyText"/>
-      </w:pPr>
-      <w:r>
-        <w:t xml:space="preserve">M2</w:t>
-      </w:r>
-    </w:p>
-    <w:p>
-      <w:pPr>
-        <w:pStyle w:val="BodyText"/>
-      </w:pPr>
-      <w:r>
-        <w:t xml:space="preserve">Registration / data collection date</w:t>
-      </w:r>
-    </w:p>
-    <w:p>
-      <w:pPr>
-        <w:pStyle w:val="BodyText"/>
-      </w:pPr>
-      <w:r>
-        <w:t xml:space="preserve">—</w:t>
-      </w:r>
-    </w:p>
-    <w:p>
-      <w:pPr>
-        <w:pStyle w:val="BodyText"/>
-      </w:pPr>
-      <w:r>
-        <w:t xml:space="preserve">Core</w:t>
-      </w:r>
-    </w:p>
-    <w:p>
-      <w:pPr>
-        <w:pStyle w:val="BodyText"/>
-      </w:pPr>
-      <w:r>
-        <w:t xml:space="preserve">IOM + ERRM + Cash Consortium + Inter-agency</w:t>
-      </w:r>
-    </w:p>
-    <w:p>
-      <w:pPr>
-        <w:pStyle w:val="BodyText"/>
-      </w:pPr>
-      <w:r>
-        <w:t xml:space="preserve">M3</w:t>
-      </w:r>
-    </w:p>
-    <w:p>
-      <w:pPr>
-        <w:pStyle w:val="BodyText"/>
-      </w:pPr>
-      <w:r>
-        <w:t xml:space="preserve">Enumerator / registrar name or ID</w:t>
-      </w:r>
-    </w:p>
-    <w:p>
-      <w:pPr>
-        <w:pStyle w:val="BodyText"/>
-      </w:pPr>
-      <w:r>
-        <w:t xml:space="preserve">—</w:t>
-      </w:r>
-    </w:p>
-    <w:p>
-      <w:pPr>
-        <w:pStyle w:val="BodyText"/>
-      </w:pPr>
-      <w:r>
-        <w:t xml:space="preserve">Core</w:t>
-      </w:r>
-    </w:p>
-    <w:p>
-      <w:pPr>
-        <w:pStyle w:val="BodyText"/>
-      </w:pPr>
-      <w:r>
-        <w:t xml:space="preserve">IOM + Cash Consortium</w:t>
-      </w:r>
-    </w:p>
-    <w:p>
-      <w:pPr>
-        <w:pStyle w:val="BodyText"/>
-      </w:pPr>
-      <w:r>
-        <w:t xml:space="preserve">M4</w:t>
-      </w:r>
-    </w:p>
-    <w:p>
-      <w:pPr>
-        <w:pStyle w:val="BodyText"/>
-      </w:pPr>
-      <w:r>
-        <w:t xml:space="preserve">Referral source</w:t>
-      </w:r>
-    </w:p>
-    <w:p>
-      <w:pPr>
-        <w:pStyle w:val="BodyText"/>
-      </w:pPr>
-      <w:r>
-        <w:t xml:space="preserve">—</w:t>
-      </w:r>
-    </w:p>
-    <w:p>
-      <w:pPr>
-        <w:pStyle w:val="BodyText"/>
-      </w:pPr>
-      <w:r>
-        <w:t xml:space="preserve">Optional</w:t>
-      </w:r>
-    </w:p>
-    <w:p>
-      <w:pPr>
-        <w:pStyle w:val="BodyText"/>
-      </w:pPr>
-      <w:r>
-        <w:t xml:space="preserve">Cash Consortium</w:t>
-      </w:r>
-    </w:p>
-    <w:p>
-      <w:pPr>
-        <w:pStyle w:val="BodyText"/>
-      </w:pPr>
-      <w:r>
-        <w:t xml:space="preserve">M5</w:t>
-      </w:r>
-    </w:p>
-    <w:p>
-      <w:pPr>
-        <w:pStyle w:val="BodyText"/>
-      </w:pPr>
-      <w:r>
-        <w:t xml:space="preserve">Verification status / verification code</w:t>
-      </w:r>
-    </w:p>
-    <w:p>
-      <w:pPr>
-        <w:pStyle w:val="BodyText"/>
-      </w:pPr>
-      <w:r>
-        <w:t xml:space="preserve">—</w:t>
-      </w:r>
-    </w:p>
-    <w:p>
-      <w:pPr>
-        <w:pStyle w:val="BodyText"/>
-      </w:pPr>
-      <w:r>
-        <w:t xml:space="preserve">Optional</w:t>
-      </w:r>
-    </w:p>
-    <w:p>
-      <w:pPr>
-        <w:pStyle w:val="BodyText"/>
-      </w:pPr>
-      <w:r>
-        <w:t xml:space="preserve">IOM + Cash Consortium</w:t>
-      </w:r>
-    </w:p>
-    <w:p>
-      <w:pPr>
-        <w:pStyle w:val="BodyText"/>
-      </w:pPr>
-      <w:r>
-        <w:t xml:space="preserve">M6</w:t>
-      </w:r>
-    </w:p>
-    <w:p>
-      <w:pPr>
-        <w:pStyle w:val="BodyText"/>
-      </w:pPr>
-      <w:r>
-        <w:t xml:space="preserve">GPS coordinates of registration location</w:t>
-      </w:r>
-    </w:p>
-    <w:p>
-      <w:pPr>
-        <w:pStyle w:val="BodyText"/>
-      </w:pPr>
-      <w:r>
-        <w:t xml:space="preserve">—</w:t>
-      </w:r>
-    </w:p>
-    <w:p>
-      <w:pPr>
-        <w:pStyle w:val="BodyText"/>
-      </w:pPr>
-      <w:r>
-        <w:t xml:space="preserve">Optional</w:t>
-      </w:r>
-    </w:p>
-    <w:p>
-      <w:pPr>
-        <w:pStyle w:val="BodyText"/>
-      </w:pPr>
-      <w:r>
-        <w:t xml:space="preserve">Somalia SRF</w:t>
-      </w:r>
-    </w:p>
-    <w:p>
-      <w:pPr>
-        <w:pStyle w:val="BodyText"/>
-      </w:pPr>
-      <w:r>
-        <w:t xml:space="preserve">M7</w:t>
-      </w:r>
-    </w:p>
-    <w:p>
-      <w:pPr>
-        <w:pStyle w:val="BodyText"/>
-      </w:pPr>
-      <w:r>
-        <w:t xml:space="preserve">Household ID (organization specific)</w:t>
-      </w:r>
-    </w:p>
-    <w:p>
-      <w:pPr>
-        <w:pStyle w:val="BodyText"/>
-      </w:pPr>
-      <w:r>
-        <w:t xml:space="preserve">—</w:t>
-      </w:r>
-    </w:p>
-    <w:p>
-      <w:pPr>
-        <w:pStyle w:val="BodyText"/>
-      </w:pPr>
-      <w:r>
-        <w:t xml:space="preserve">Core</w:t>
-      </w:r>
-    </w:p>
-    <w:p>
-      <w:pPr>
-        <w:pStyle w:val="BodyText"/>
-      </w:pPr>
-      <w:r>
-        <w:t xml:space="preserve">Inter-agency + IOM + Cash Consortium + ERRM</w:t>
-      </w:r>
-    </w:p>
-    <w:p>
-      <w:pPr>
-        <w:pStyle w:val="BodyText"/>
-      </w:pPr>
-      <w:r>
-        <w:t xml:space="preserve">M8</w:t>
-      </w:r>
-    </w:p>
-    <w:p>
-      <w:pPr>
-        <w:pStyle w:val="BodyText"/>
-      </w:pPr>
-      <w:r>
-        <w:t xml:space="preserve">Individual ID (organization specific)</w:t>
-      </w:r>
-    </w:p>
-    <w:p>
-      <w:pPr>
-        <w:pStyle w:val="BodyText"/>
-      </w:pPr>
-      <w:r>
-        <w:t xml:space="preserve">—</w:t>
-      </w:r>
-    </w:p>
-    <w:p>
-      <w:pPr>
-        <w:pStyle w:val="BodyText"/>
-      </w:pPr>
-      <w:r>
-        <w:t xml:space="preserve">Optional</w:t>
-      </w:r>
-    </w:p>
-    <w:p>
-      <w:pPr>
-        <w:pStyle w:val="BodyText"/>
-      </w:pPr>
-      <w:r>
-        <w:t xml:space="preserve">None</w:t>
-      </w:r>
-    </w:p>
-    <w:p>
-      <w:pPr>
-        <w:pStyle w:val="BodyText"/>
-      </w:pPr>
-      <w:r>
-        <w:t xml:space="preserve">Biographic</w:t>
-      </w:r>
-    </w:p>
-    <w:p>
-      <w:pPr>
-        <w:pStyle w:val="BodyText"/>
-      </w:pPr>
-      <w:r>
-        <w:t xml:space="preserve">B1</w:t>
-      </w:r>
-    </w:p>
-    <w:p>
-      <w:pPr>
-        <w:pStyle w:val="BodyText"/>
-      </w:pPr>
-      <w:r>
-        <w:t xml:space="preserve">Admin 1 (State)</w:t>
-      </w:r>
-    </w:p>
-    <w:p>
-      <w:pPr>
-        <w:pStyle w:val="BodyText"/>
-      </w:pPr>
-      <w:r>
-        <w:t xml:space="preserve">Household</w:t>
-      </w:r>
-    </w:p>
-    <w:p>
-      <w:pPr>
-        <w:pStyle w:val="BodyText"/>
-      </w:pPr>
-      <w:r>
-        <w:t xml:space="preserve">Core</w:t>
-      </w:r>
-    </w:p>
-    <w:p>
-      <w:pPr>
-        <w:pStyle w:val="BodyText"/>
-      </w:pPr>
-      <w:r>
-        <w:t xml:space="preserve">Cash Consortium + ERRM + IOM</w:t>
-      </w:r>
-    </w:p>
-    <w:p>
-      <w:pPr>
-        <w:pStyle w:val="BodyText"/>
-      </w:pPr>
-      <w:r>
-        <w:t xml:space="preserve">B2</w:t>
-      </w:r>
-    </w:p>
-    <w:p>
-      <w:pPr>
-        <w:pStyle w:val="BodyText"/>
-      </w:pPr>
-      <w:r>
-        <w:t xml:space="preserve">Admin 2 (County)</w:t>
-      </w:r>
-    </w:p>
-    <w:p>
-      <w:pPr>
-        <w:pStyle w:val="BodyText"/>
-      </w:pPr>
-      <w:r>
-        <w:t xml:space="preserve">Household</w:t>
-      </w:r>
-    </w:p>
-    <w:p>
-      <w:pPr>
-        <w:pStyle w:val="BodyText"/>
-      </w:pPr>
-      <w:r>
-        <w:t xml:space="preserve">Core</w:t>
-      </w:r>
-    </w:p>
-    <w:p>
-      <w:pPr>
-        <w:pStyle w:val="BodyText"/>
-      </w:pPr>
-      <w:r>
-        <w:t xml:space="preserve">Cash Consortium + ERRM + IOM</w:t>
-      </w:r>
-    </w:p>
-    <w:p>
-      <w:pPr>
-        <w:pStyle w:val="BodyText"/>
-      </w:pPr>
-      <w:r>
-        <w:t xml:space="preserve">B3</w:t>
-      </w:r>
-    </w:p>
-    <w:p>
-      <w:pPr>
-        <w:pStyle w:val="BodyText"/>
-      </w:pPr>
-      <w:r>
-        <w:t xml:space="preserve">Admin 3 (Payam)</w:t>
-      </w:r>
-    </w:p>
-    <w:p>
-      <w:pPr>
-        <w:pStyle w:val="BodyText"/>
-      </w:pPr>
-      <w:r>
-        <w:t xml:space="preserve">Household</w:t>
-      </w:r>
-    </w:p>
-    <w:p>
-      <w:pPr>
-        <w:pStyle w:val="BodyText"/>
-      </w:pPr>
-      <w:r>
-        <w:t xml:space="preserve">Core</w:t>
-      </w:r>
-    </w:p>
-    <w:p>
-      <w:pPr>
-        <w:pStyle w:val="BodyText"/>
-      </w:pPr>
-      <w:r>
-        <w:t xml:space="preserve">Cash Consortium + ERRM + IOM</w:t>
-      </w:r>
-    </w:p>
-    <w:p>
-      <w:pPr>
-        <w:pStyle w:val="BodyText"/>
-      </w:pPr>
-      <w:r>
-        <w:t xml:space="preserve">B4</w:t>
-      </w:r>
-    </w:p>
-    <w:p>
-      <w:pPr>
-        <w:pStyle w:val="BodyText"/>
-      </w:pPr>
-      <w:r>
-        <w:t xml:space="preserve">Admin 4 (Boma) / village / block / site</w:t>
-      </w:r>
-    </w:p>
-    <w:p>
-      <w:pPr>
-        <w:pStyle w:val="BodyText"/>
-      </w:pPr>
-      <w:r>
-        <w:t xml:space="preserve">Household</w:t>
-      </w:r>
-    </w:p>
-    <w:p>
-      <w:pPr>
-        <w:pStyle w:val="BodyText"/>
-      </w:pPr>
-      <w:r>
-        <w:t xml:space="preserve">Core</w:t>
-      </w:r>
-    </w:p>
-    <w:p>
-      <w:pPr>
-        <w:pStyle w:val="BodyText"/>
-      </w:pPr>
-      <w:r>
-        <w:t xml:space="preserve">Cash Consortium + IOM + ERRM</w:t>
-      </w:r>
-    </w:p>
-    <w:p>
-      <w:pPr>
-        <w:pStyle w:val="BodyText"/>
-      </w:pPr>
-      <w:r>
-        <w:t xml:space="preserve">B5</w:t>
-      </w:r>
-    </w:p>
-    <w:p>
-      <w:pPr>
-        <w:pStyle w:val="BodyText"/>
-      </w:pPr>
-      <w:r>
-        <w:t xml:space="preserve">Place of origin / initial displacement location</w:t>
-      </w:r>
-    </w:p>
-    <w:p>
-      <w:pPr>
-        <w:pStyle w:val="BodyText"/>
-      </w:pPr>
-      <w:r>
-        <w:t xml:space="preserve">Household</w:t>
-      </w:r>
-    </w:p>
-    <w:p>
-      <w:pPr>
-        <w:pStyle w:val="BodyText"/>
-      </w:pPr>
-      <w:r>
-        <w:t xml:space="preserve">Optional</w:t>
-      </w:r>
-    </w:p>
-    <w:p>
-      <w:pPr>
-        <w:pStyle w:val="BodyText"/>
-      </w:pPr>
-      <w:r>
-        <w:t xml:space="preserve">IOM + ERRM</w:t>
-      </w:r>
-    </w:p>
-    <w:p>
-      <w:pPr>
-        <w:pStyle w:val="BodyText"/>
-      </w:pPr>
-      <w:r>
-        <w:t xml:space="preserve">B6</w:t>
-      </w:r>
-    </w:p>
-    <w:p>
-      <w:pPr>
-        <w:pStyle w:val="BodyText"/>
-      </w:pPr>
-      <w:r>
-        <w:t xml:space="preserve">Humanitarian profile / displacement status</w:t>
-      </w:r>
-    </w:p>
-    <w:p>
-      <w:pPr>
-        <w:pStyle w:val="BodyText"/>
-      </w:pPr>
-      <w:r>
-        <w:t xml:space="preserve">Household</w:t>
-      </w:r>
-    </w:p>
-    <w:p>
-      <w:pPr>
-        <w:pStyle w:val="BodyText"/>
-      </w:pPr>
-      <w:r>
-        <w:t xml:space="preserve">Core</w:t>
-      </w:r>
-    </w:p>
-    <w:p>
-      <w:pPr>
-        <w:pStyle w:val="BodyText"/>
-      </w:pPr>
-      <w:r>
-        <w:t xml:space="preserve">Inter-agency + IOM + Cash Consortium + ERRM</w:t>
-      </w:r>
-    </w:p>
-    <w:p>
-      <w:pPr>
-        <w:pStyle w:val="BodyText"/>
-      </w:pPr>
-      <w:r>
-        <w:t xml:space="preserve">B7</w:t>
-      </w:r>
-    </w:p>
-    <w:p>
-      <w:pPr>
-        <w:pStyle w:val="BodyText"/>
-      </w:pPr>
-      <w:r>
-        <w:t xml:space="preserve">Primary recipient / head of household full name</w:t>
-      </w:r>
-    </w:p>
-    <w:p>
-      <w:pPr>
-        <w:pStyle w:val="BodyText"/>
-      </w:pPr>
-      <w:r>
-        <w:t xml:space="preserve">Individual</w:t>
-      </w:r>
-    </w:p>
-    <w:p>
-      <w:pPr>
-        <w:pStyle w:val="BodyText"/>
-      </w:pPr>
-      <w:r>
-        <w:t xml:space="preserve">Core</w:t>
-      </w:r>
-    </w:p>
-    <w:p>
-      <w:pPr>
-        <w:pStyle w:val="BodyText"/>
-      </w:pPr>
-      <w:r>
-        <w:t xml:space="preserve">Inter-agency + Cash Consortium + IOM + ERRM</w:t>
-      </w:r>
-    </w:p>
-    <w:p>
-      <w:pPr>
-        <w:pStyle w:val="BodyText"/>
-      </w:pPr>
-      <w:r>
-        <w:t xml:space="preserve">B8</w:t>
-      </w:r>
-    </w:p>
-    <w:p>
-      <w:pPr>
-        <w:pStyle w:val="BodyText"/>
-      </w:pPr>
-      <w:r>
-        <w:t xml:space="preserve">Primary recipient / head of household gender</w:t>
-      </w:r>
-    </w:p>
-    <w:p>
-      <w:pPr>
-        <w:pStyle w:val="BodyText"/>
-      </w:pPr>
-      <w:r>
-        <w:t xml:space="preserve">Individual</w:t>
-      </w:r>
-    </w:p>
-    <w:p>
-      <w:pPr>
-        <w:pStyle w:val="BodyText"/>
-      </w:pPr>
-      <w:r>
-        <w:t xml:space="preserve">Core</w:t>
-      </w:r>
-    </w:p>
-    <w:p>
-      <w:pPr>
-        <w:pStyle w:val="BodyText"/>
-      </w:pPr>
-      <w:r>
-        <w:t xml:space="preserve">Inter-agency + Cash Consortium + IOM</w:t>
-      </w:r>
-    </w:p>
-    <w:p>
-      <w:pPr>
-        <w:pStyle w:val="BodyText"/>
-      </w:pPr>
-      <w:r>
-        <w:t xml:space="preserve">B9</w:t>
-      </w:r>
-    </w:p>
-    <w:p>
-      <w:pPr>
-        <w:pStyle w:val="BodyText"/>
-      </w:pPr>
-      <w:r>
-        <w:t xml:space="preserve">Primary recipient / head of household date of birth or estimated age</w:t>
-      </w:r>
-    </w:p>
-    <w:p>
-      <w:pPr>
-        <w:pStyle w:val="BodyText"/>
-      </w:pPr>
-      <w:r>
-        <w:t xml:space="preserve">Individual</w:t>
-      </w:r>
-    </w:p>
-    <w:p>
-      <w:pPr>
-        <w:pStyle w:val="BodyText"/>
-      </w:pPr>
-      <w:r>
-        <w:t xml:space="preserve">Core</w:t>
-      </w:r>
-    </w:p>
-    <w:p>
-      <w:pPr>
-        <w:pStyle w:val="BodyText"/>
-      </w:pPr>
-      <w:r>
-        <w:t xml:space="preserve">Inter-agency + Cash Consortium + IOM</w:t>
-      </w:r>
-    </w:p>
-    <w:p>
-      <w:pPr>
-        <w:pStyle w:val="BodyText"/>
-      </w:pPr>
-      <w:r>
-        <w:t xml:space="preserve">B10</w:t>
-      </w:r>
-    </w:p>
-    <w:p>
-      <w:pPr>
-        <w:pStyle w:val="BodyText"/>
-      </w:pPr>
-      <w:r>
-        <w:t xml:space="preserve">Primary recipient / head of household phone number</w:t>
-      </w:r>
-    </w:p>
-    <w:p>
-      <w:pPr>
-        <w:pStyle w:val="BodyText"/>
-      </w:pPr>
-      <w:r>
-        <w:t xml:space="preserve">Individual</w:t>
-      </w:r>
-    </w:p>
-    <w:p>
-      <w:pPr>
-        <w:pStyle w:val="BodyText"/>
-      </w:pPr>
-      <w:r>
-        <w:t xml:space="preserve">Optional</w:t>
-      </w:r>
-    </w:p>
-    <w:p>
-      <w:pPr>
-        <w:pStyle w:val="BodyText"/>
-      </w:pPr>
-      <w:r>
-        <w:t xml:space="preserve">Inter-agency + IOM + ERRM + Cash Consortium</w:t>
-      </w:r>
-    </w:p>
-    <w:p>
-      <w:pPr>
-        <w:pStyle w:val="BodyText"/>
-      </w:pPr>
-      <w:r>
-        <w:t xml:space="preserve">B11</w:t>
-      </w:r>
-    </w:p>
-    <w:p>
-      <w:pPr>
-        <w:pStyle w:val="BodyText"/>
-      </w:pPr>
-      <w:r>
-        <w:t xml:space="preserve">Primary recipient nationality</w:t>
-      </w:r>
-    </w:p>
-    <w:p>
-      <w:pPr>
-        <w:pStyle w:val="BodyText"/>
-      </w:pPr>
-      <w:r>
-        <w:t xml:space="preserve">Individual</w:t>
-      </w:r>
-    </w:p>
-    <w:p>
-      <w:pPr>
-        <w:pStyle w:val="BodyText"/>
-      </w:pPr>
-      <w:r>
-        <w:t xml:space="preserve">Optional</w:t>
-      </w:r>
-    </w:p>
-    <w:p>
-      <w:pPr>
-        <w:pStyle w:val="BodyText"/>
-      </w:pPr>
-      <w:r>
-        <w:t xml:space="preserve">IOM</w:t>
-      </w:r>
-    </w:p>
-    <w:p>
-      <w:pPr>
-        <w:pStyle w:val="BodyText"/>
-      </w:pPr>
-      <w:r>
-        <w:t xml:space="preserve">B12</w:t>
-      </w:r>
-    </w:p>
-    <w:p>
-      <w:pPr>
-        <w:pStyle w:val="BodyText"/>
-      </w:pPr>
-      <w:r>
-        <w:t xml:space="preserve">Government / civil ID type and number</w:t>
-      </w:r>
-    </w:p>
-    <w:p>
-      <w:pPr>
-        <w:pStyle w:val="BodyText"/>
-      </w:pPr>
-      <w:r>
-        <w:t xml:space="preserve">Individual</w:t>
-      </w:r>
-    </w:p>
-    <w:p>
-      <w:pPr>
-        <w:pStyle w:val="BodyText"/>
-      </w:pPr>
-      <w:r>
-        <w:t xml:space="preserve">Optional</w:t>
-      </w:r>
-    </w:p>
-    <w:p>
-      <w:pPr>
-        <w:pStyle w:val="BodyText"/>
-      </w:pPr>
-      <w:r>
-        <w:t xml:space="preserve">Inter-agency + IOM</w:t>
-      </w:r>
-    </w:p>
-    <w:p>
-      <w:pPr>
-        <w:pStyle w:val="BodyText"/>
-      </w:pPr>
-      <w:r>
-        <w:t xml:space="preserve">B13</w:t>
-      </w:r>
-    </w:p>
-    <w:p>
-      <w:pPr>
-        <w:pStyle w:val="BodyText"/>
-      </w:pPr>
-      <w:r>
-        <w:t xml:space="preserve">Alternative assistance collector full name</w:t>
-      </w:r>
-    </w:p>
-    <w:p>
-      <w:pPr>
-        <w:pStyle w:val="BodyText"/>
-      </w:pPr>
-      <w:r>
-        <w:t xml:space="preserve">Individual</w:t>
-      </w:r>
-    </w:p>
-    <w:p>
-      <w:pPr>
-        <w:pStyle w:val="BodyText"/>
-      </w:pPr>
-      <w:r>
-        <w:t xml:space="preserve">Optional</w:t>
-      </w:r>
-    </w:p>
-    <w:p>
-      <w:pPr>
-        <w:pStyle w:val="BodyText"/>
-      </w:pPr>
-      <w:r>
-        <w:t xml:space="preserve">Inter-agency + Cash Consortium</w:t>
-      </w:r>
-    </w:p>
-    <w:p>
-      <w:pPr>
-        <w:pStyle w:val="BodyText"/>
-      </w:pPr>
-      <w:r>
-        <w:t xml:space="preserve">B14</w:t>
-      </w:r>
-    </w:p>
-    <w:p>
-      <w:pPr>
-        <w:pStyle w:val="BodyText"/>
-      </w:pPr>
-      <w:r>
-        <w:t xml:space="preserve">Household members full names</w:t>
-      </w:r>
-    </w:p>
-    <w:p>
-      <w:pPr>
-        <w:pStyle w:val="BodyText"/>
-      </w:pPr>
-      <w:r>
-        <w:t xml:space="preserve">Individual</w:t>
-      </w:r>
-    </w:p>
-    <w:p>
-      <w:pPr>
-        <w:pStyle w:val="BodyText"/>
-      </w:pPr>
-      <w:r>
-        <w:t xml:space="preserve">Optional</w:t>
-      </w:r>
-    </w:p>
-    <w:p>
-      <w:pPr>
-        <w:pStyle w:val="BodyText"/>
-      </w:pPr>
-      <w:r>
-        <w:t xml:space="preserve">IOM</w:t>
-      </w:r>
-    </w:p>
-    <w:p>
-      <w:pPr>
-        <w:pStyle w:val="BodyText"/>
-      </w:pPr>
-      <w:r>
-        <w:t xml:space="preserve">B15</w:t>
-      </w:r>
-    </w:p>
-    <w:p>
-      <w:pPr>
-        <w:pStyle w:val="BodyText"/>
-      </w:pPr>
-      <w:r>
-        <w:t xml:space="preserve">Household members gender</w:t>
-      </w:r>
-    </w:p>
-    <w:p>
-      <w:pPr>
-        <w:pStyle w:val="BodyText"/>
-      </w:pPr>
-      <w:r>
-        <w:t xml:space="preserve">Individual</w:t>
-      </w:r>
-    </w:p>
-    <w:p>
-      <w:pPr>
-        <w:pStyle w:val="BodyText"/>
-      </w:pPr>
-      <w:r>
-        <w:t xml:space="preserve">Optional</w:t>
-      </w:r>
-    </w:p>
-    <w:p>
-      <w:pPr>
-        <w:pStyle w:val="BodyText"/>
-      </w:pPr>
-      <w:r>
-        <w:t xml:space="preserve">IOM + Inter-agency</w:t>
-      </w:r>
-    </w:p>
-    <w:p>
-      <w:pPr>
-        <w:pStyle w:val="BodyText"/>
-      </w:pPr>
-      <w:r>
-        <w:t xml:space="preserve">B16</w:t>
-      </w:r>
-    </w:p>
-    <w:p>
-      <w:pPr>
-        <w:pStyle w:val="BodyText"/>
-      </w:pPr>
-      <w:r>
-        <w:t xml:space="preserve">Household members date of birth</w:t>
-      </w:r>
-    </w:p>
-    <w:p>
-      <w:pPr>
-        <w:pStyle w:val="BodyText"/>
-      </w:pPr>
-      <w:r>
-        <w:t xml:space="preserve">Individual</w:t>
-      </w:r>
-    </w:p>
-    <w:p>
-      <w:pPr>
-        <w:pStyle w:val="BodyText"/>
-      </w:pPr>
-      <w:r>
-        <w:t xml:space="preserve">Optional</w:t>
-      </w:r>
-    </w:p>
-    <w:p>
-      <w:pPr>
-        <w:pStyle w:val="BodyText"/>
-      </w:pPr>
-      <w:r>
-        <w:t xml:space="preserve">IOM + Inter-agency</w:t>
-      </w:r>
-    </w:p>
-    <w:p>
-      <w:pPr>
-        <w:pStyle w:val="BodyText"/>
-      </w:pPr>
-      <w:r>
-        <w:t xml:space="preserve">B17</w:t>
-      </w:r>
-    </w:p>
-    <w:p>
-      <w:pPr>
-        <w:pStyle w:val="BodyText"/>
-      </w:pPr>
-      <w:r>
-        <w:t xml:space="preserve">Relationship to head of household</w:t>
-      </w:r>
-    </w:p>
-    <w:p>
-      <w:pPr>
-        <w:pStyle w:val="BodyText"/>
-      </w:pPr>
-      <w:r>
-        <w:t xml:space="preserve">Individual</w:t>
-      </w:r>
-    </w:p>
-    <w:p>
-      <w:pPr>
-        <w:pStyle w:val="BodyText"/>
-      </w:pPr>
-      <w:r>
-        <w:t xml:space="preserve">Optional</w:t>
-      </w:r>
-    </w:p>
-    <w:p>
-      <w:pPr>
-        <w:pStyle w:val="BodyText"/>
-      </w:pPr>
-      <w:r>
-        <w:t xml:space="preserve">IOM + Inter-agency</w:t>
-      </w:r>
-    </w:p>
-    <w:p>
-      <w:pPr>
-        <w:pStyle w:val="BodyText"/>
-      </w:pPr>
-      <w:r>
-        <w:t xml:space="preserve">Biometrics</w:t>
-      </w:r>
-    </w:p>
-    <w:p>
-      <w:pPr>
-        <w:pStyle w:val="BodyText"/>
-      </w:pPr>
-      <w:r>
-        <w:t xml:space="preserve">BM1</w:t>
-      </w:r>
-    </w:p>
-    <w:p>
-      <w:pPr>
-        <w:pStyle w:val="BodyText"/>
-      </w:pPr>
-      <w:r>
-        <w:t xml:space="preserve">Photo image of primary recipient / collector</w:t>
-      </w:r>
-    </w:p>
-    <w:p>
-      <w:pPr>
-        <w:pStyle w:val="BodyText"/>
-      </w:pPr>
-      <w:r>
-        <w:t xml:space="preserve">Individual</w:t>
-      </w:r>
-    </w:p>
-    <w:p>
-      <w:pPr>
-        <w:pStyle w:val="BodyText"/>
-      </w:pPr>
-      <w:r>
-        <w:t xml:space="preserve">Optional</w:t>
-      </w:r>
-    </w:p>
-    <w:p>
-      <w:pPr>
-        <w:pStyle w:val="BodyText"/>
-      </w:pPr>
-      <w:r>
-        <w:t xml:space="preserve">IOM + Inter-agency</w:t>
-      </w:r>
-    </w:p>
-    <w:p>
-      <w:pPr>
-        <w:pStyle w:val="BodyText"/>
-      </w:pPr>
-      <w:r>
-        <w:t xml:space="preserve">BM2</w:t>
-      </w:r>
-    </w:p>
-    <w:p>
-      <w:pPr>
-        <w:pStyle w:val="BodyText"/>
-      </w:pPr>
-      <w:r>
-        <w:t xml:space="preserve">Fingerprint / biometric template</w:t>
-      </w:r>
-    </w:p>
-    <w:p>
-      <w:pPr>
-        <w:pStyle w:val="BodyText"/>
-      </w:pPr>
-      <w:r>
-        <w:t xml:space="preserve">Individual</w:t>
-      </w:r>
-    </w:p>
-    <w:p>
-      <w:pPr>
-        <w:pStyle w:val="BodyText"/>
-      </w:pPr>
-      <w:r>
-        <w:t xml:space="preserve">Optional</w:t>
-      </w:r>
-    </w:p>
-    <w:p>
-      <w:pPr>
-        <w:pStyle w:val="BodyText"/>
-      </w:pPr>
-      <w:r>
-        <w:t xml:space="preserve">IOM + Inter-agency</w:t>
-      </w:r>
-    </w:p>
-    <w:p>
-      <w:pPr>
-        <w:pStyle w:val="BodyText"/>
-      </w:pPr>
-      <w:r>
-        <w:t xml:space="preserve">Individual survey</w:t>
-      </w:r>
-    </w:p>
-    <w:p>
-      <w:pPr>
-        <w:pStyle w:val="BodyText"/>
-      </w:pPr>
-      <w:r>
-        <w:t xml:space="preserve">IS1</w:t>
-      </w:r>
-    </w:p>
-    <w:p>
-      <w:pPr>
-        <w:pStyle w:val="BodyText"/>
-      </w:pPr>
-      <w:r>
-        <w:t xml:space="preserve">Primary recipient disability / accessibility needs</w:t>
-      </w:r>
-    </w:p>
-    <w:p>
-      <w:pPr>
-        <w:pStyle w:val="BodyText"/>
-      </w:pPr>
-      <w:r>
-        <w:t xml:space="preserve">Individual</w:t>
-      </w:r>
-    </w:p>
-    <w:p>
-      <w:pPr>
-        <w:pStyle w:val="BodyText"/>
-      </w:pPr>
-      <w:r>
-        <w:t xml:space="preserve">Core</w:t>
-      </w:r>
-    </w:p>
-    <w:p>
-      <w:pPr>
-        <w:pStyle w:val="BodyText"/>
-      </w:pPr>
-      <w:r>
-        <w:t xml:space="preserve">Inter-agency + IOM</w:t>
-      </w:r>
-    </w:p>
-    <w:p>
-      <w:pPr>
-        <w:pStyle w:val="BodyText"/>
-      </w:pPr>
-      <w:r>
-        <w:t xml:space="preserve">IS2</w:t>
-      </w:r>
-    </w:p>
-    <w:p>
-      <w:pPr>
-        <w:pStyle w:val="BodyText"/>
-      </w:pPr>
-      <w:r>
-        <w:t xml:space="preserve">Pregant</w:t>
-      </w:r>
-    </w:p>
-    <w:p>
-      <w:pPr>
-        <w:pStyle w:val="BodyText"/>
-      </w:pPr>
-      <w:r>
-        <w:t xml:space="preserve">Individual</w:t>
-      </w:r>
-    </w:p>
-    <w:p>
-      <w:pPr>
-        <w:pStyle w:val="BodyText"/>
-      </w:pPr>
-      <w:r>
-        <w:t xml:space="preserve">Optional</w:t>
-      </w:r>
-    </w:p>
-    <w:p>
-      <w:pPr>
-        <w:pStyle w:val="BodyText"/>
-      </w:pPr>
-      <w:r>
-        <w:t xml:space="preserve">Food Security Cluster</w:t>
-      </w:r>
-    </w:p>
-    <w:p>
-      <w:pPr>
-        <w:pStyle w:val="BodyText"/>
-      </w:pPr>
-      <w:r>
-        <w:t xml:space="preserve">IS3</w:t>
-      </w:r>
-    </w:p>
-    <w:p>
-      <w:pPr>
-        <w:pStyle w:val="BodyText"/>
-      </w:pPr>
-      <w:r>
-        <w:t xml:space="preserve">Lactating</w:t>
-      </w:r>
-    </w:p>
-    <w:p>
-      <w:pPr>
-        <w:pStyle w:val="BodyText"/>
-      </w:pPr>
-      <w:r>
-        <w:t xml:space="preserve">Individual</w:t>
-      </w:r>
-    </w:p>
-    <w:p>
-      <w:pPr>
-        <w:pStyle w:val="BodyText"/>
-      </w:pPr>
-      <w:r>
-        <w:t xml:space="preserve">Optional</w:t>
-      </w:r>
-    </w:p>
-    <w:p>
-      <w:pPr>
-        <w:pStyle w:val="BodyText"/>
-      </w:pPr>
-      <w:r>
-        <w:t xml:space="preserve">Food Security Cluster</w:t>
-      </w:r>
-    </w:p>
-    <w:p>
-      <w:pPr>
-        <w:pStyle w:val="BodyText"/>
-      </w:pPr>
-      <w:r>
-        <w:t xml:space="preserve">IS4</w:t>
-      </w:r>
-    </w:p>
-    <w:p>
-      <w:pPr>
-        <w:pStyle w:val="BodyText"/>
-      </w:pPr>
-      <w:r>
-        <w:t xml:space="preserve">Chronic illness</w:t>
-      </w:r>
-    </w:p>
-    <w:p>
-      <w:pPr>
-        <w:pStyle w:val="BodyText"/>
-      </w:pPr>
-      <w:r>
-        <w:t xml:space="preserve">Individual</w:t>
-      </w:r>
-    </w:p>
-    <w:p>
-      <w:pPr>
-        <w:pStyle w:val="BodyText"/>
-      </w:pPr>
-      <w:r>
-        <w:t xml:space="preserve">Optional</w:t>
-      </w:r>
-    </w:p>
-    <w:p>
-      <w:pPr>
-        <w:pStyle w:val="BodyText"/>
-      </w:pPr>
-      <w:r>
-        <w:t xml:space="preserve">Food Security Cluster</w:t>
-      </w:r>
-    </w:p>
-    <w:p>
-      <w:pPr>
-        <w:pStyle w:val="BodyText"/>
-      </w:pPr>
-      <w:r>
-        <w:t xml:space="preserve">IS5</w:t>
-      </w:r>
-    </w:p>
-    <w:p>
-      <w:pPr>
-        <w:pStyle w:val="BodyText"/>
-      </w:pPr>
-      <w:r>
-        <w:t xml:space="preserve">Ever received a vaccination</w:t>
-      </w:r>
-    </w:p>
-    <w:p>
-      <w:pPr>
-        <w:pStyle w:val="BodyText"/>
-      </w:pPr>
-      <w:r>
-        <w:t xml:space="preserve">Individual</w:t>
-      </w:r>
-    </w:p>
-    <w:p>
-      <w:pPr>
-        <w:pStyle w:val="BodyText"/>
-      </w:pPr>
-      <w:r>
-        <w:t xml:space="preserve">Optional</w:t>
-      </w:r>
-    </w:p>
-    <w:p>
-      <w:pPr>
-        <w:pStyle w:val="BodyText"/>
-      </w:pPr>
-      <w:r>
-        <w:t xml:space="preserve">Health Cluster</w:t>
-      </w:r>
-    </w:p>
-    <w:p>
-      <w:pPr>
-        <w:pStyle w:val="BodyText"/>
-      </w:pPr>
-      <w:r>
-        <w:t xml:space="preserve">Household survey</w:t>
-      </w:r>
-    </w:p>
-    <w:p>
-      <w:pPr>
-        <w:pStyle w:val="BodyText"/>
-      </w:pPr>
-      <w:r>
-        <w:t xml:space="preserve">HH1</w:t>
-      </w:r>
-    </w:p>
-    <w:p>
-      <w:pPr>
-        <w:pStyle w:val="BodyText"/>
-      </w:pPr>
-      <w:r>
-        <w:t xml:space="preserve">Household size</w:t>
-      </w:r>
-    </w:p>
-    <w:p>
-      <w:pPr>
-        <w:pStyle w:val="BodyText"/>
-      </w:pPr>
-      <w:r>
-        <w:t xml:space="preserve">Household</w:t>
-      </w:r>
-    </w:p>
-    <w:p>
-      <w:pPr>
-        <w:pStyle w:val="BodyText"/>
-      </w:pPr>
-      <w:r>
-        <w:t xml:space="preserve">Core</w:t>
-      </w:r>
-    </w:p>
-    <w:p>
-      <w:pPr>
-        <w:pStyle w:val="BodyText"/>
-      </w:pPr>
-      <w:r>
-        <w:t xml:space="preserve">Inter-agency + IOM + ERRM + Cash Consortium</w:t>
-      </w:r>
-    </w:p>
-    <w:p>
-      <w:pPr>
-        <w:pStyle w:val="BodyText"/>
-      </w:pPr>
-      <w:r>
-        <w:t xml:space="preserve">HH2</w:t>
-      </w:r>
-    </w:p>
-    <w:p>
-      <w:pPr>
-        <w:pStyle w:val="BodyText"/>
-      </w:pPr>
-      <w:r>
-        <w:t xml:space="preserve">Household sex-age cohort summary</w:t>
-      </w:r>
-    </w:p>
-    <w:p>
-      <w:pPr>
-        <w:pStyle w:val="BodyText"/>
-      </w:pPr>
-      <w:r>
-        <w:t xml:space="preserve">Household</w:t>
-      </w:r>
-    </w:p>
-    <w:p>
-      <w:pPr>
-        <w:pStyle w:val="BodyText"/>
-      </w:pPr>
-      <w:r>
-        <w:t xml:space="preserve">Core</w:t>
-      </w:r>
-    </w:p>
-    <w:p>
-      <w:pPr>
-        <w:pStyle w:val="BodyText"/>
-      </w:pPr>
-      <w:r>
-        <w:t xml:space="preserve">ERRM + Cash Consortium + Inter-agency</w:t>
-      </w:r>
-    </w:p>
-    <w:p>
-      <w:pPr>
-        <w:pStyle w:val="BodyText"/>
-      </w:pPr>
-      <w:r>
-        <w:t xml:space="preserve">HH3</w:t>
-      </w:r>
-    </w:p>
-    <w:p>
-      <w:pPr>
-        <w:pStyle w:val="BodyText"/>
-      </w:pPr>
-      <w:r>
-        <w:t xml:space="preserve">Crisis type / trigger / shock</w:t>
-      </w:r>
-    </w:p>
-    <w:p>
-      <w:pPr>
-        <w:pStyle w:val="BodyText"/>
-      </w:pPr>
-      <w:r>
-        <w:t xml:space="preserve">Household</w:t>
-      </w:r>
-    </w:p>
-    <w:p>
-      <w:pPr>
-        <w:pStyle w:val="BodyText"/>
-      </w:pPr>
-      <w:r>
-        <w:t xml:space="preserve">Optional</w:t>
-      </w:r>
-    </w:p>
-    <w:p>
-      <w:pPr>
-        <w:pStyle w:val="BodyText"/>
-      </w:pPr>
-      <w:r>
-        <w:t xml:space="preserve">IOM + Cash Consortium +FSC</w:t>
-      </w:r>
-    </w:p>
-    <w:p>
-      <w:pPr>
-        <w:pStyle w:val="BodyText"/>
-      </w:pPr>
-      <w:r>
-        <w:t xml:space="preserve">HH4</w:t>
-      </w:r>
-    </w:p>
-    <w:p>
-      <w:pPr>
-        <w:pStyle w:val="BodyText"/>
-      </w:pPr>
-      <w:r>
-        <w:t xml:space="preserve">Main livelihood source in the past 3 months</w:t>
-      </w:r>
-    </w:p>
-    <w:p>
-      <w:pPr>
-        <w:pStyle w:val="BodyText"/>
-      </w:pPr>
-      <w:r>
-        <w:t xml:space="preserve">Household</w:t>
-      </w:r>
-    </w:p>
-    <w:p>
-      <w:pPr>
-        <w:pStyle w:val="BodyText"/>
-      </w:pPr>
-      <w:r>
-        <w:t xml:space="preserve">Optional</w:t>
-      </w:r>
-    </w:p>
-    <w:p>
-      <w:pPr>
-        <w:pStyle w:val="BodyText"/>
-      </w:pPr>
-      <w:r>
-        <w:t xml:space="preserve">Food Security Cluster</w:t>
-      </w:r>
-    </w:p>
-    <w:p>
-      <w:pPr>
-        <w:pStyle w:val="BodyText"/>
-      </w:pPr>
-      <w:r>
-        <w:t xml:space="preserve">HH5</w:t>
-      </w:r>
-    </w:p>
-    <w:p>
-      <w:pPr>
-        <w:pStyle w:val="BodyText"/>
-      </w:pPr>
-      <w:r>
-        <w:t xml:space="preserve">Loss of main livelihood in past 12 months</w:t>
-      </w:r>
-    </w:p>
-    <w:p>
-      <w:pPr>
-        <w:pStyle w:val="BodyText"/>
-      </w:pPr>
-      <w:r>
-        <w:t xml:space="preserve">Household</w:t>
-      </w:r>
-    </w:p>
-    <w:p>
-      <w:pPr>
-        <w:pStyle w:val="BodyText"/>
-      </w:pPr>
-      <w:r>
-        <w:t xml:space="preserve">Optional</w:t>
-      </w:r>
-    </w:p>
-    <w:p>
-      <w:pPr>
-        <w:pStyle w:val="BodyText"/>
-      </w:pPr>
-      <w:r>
-        <w:t xml:space="preserve">Food Security Cluster</w:t>
-      </w:r>
-    </w:p>
-    <w:p>
-      <w:pPr>
-        <w:pStyle w:val="BodyText"/>
-      </w:pPr>
-      <w:r>
-        <w:t xml:space="preserve">HH6</w:t>
-      </w:r>
-    </w:p>
-    <w:p>
-      <w:pPr>
-        <w:pStyle w:val="BodyText"/>
-      </w:pPr>
-      <w:r>
-        <w:t xml:space="preserve">Access to productive assets</w:t>
-      </w:r>
-    </w:p>
-    <w:p>
-      <w:pPr>
-        <w:pStyle w:val="BodyText"/>
-      </w:pPr>
-      <w:r>
-        <w:t xml:space="preserve">Household</w:t>
-      </w:r>
-    </w:p>
-    <w:p>
-      <w:pPr>
-        <w:pStyle w:val="BodyText"/>
-      </w:pPr>
-      <w:r>
-        <w:t xml:space="preserve">Optional</w:t>
-      </w:r>
-    </w:p>
-    <w:p>
-      <w:pPr>
-        <w:pStyle w:val="BodyText"/>
-      </w:pPr>
-      <w:r>
-        <w:t xml:space="preserve">Food Security Cluster</w:t>
-      </w:r>
-    </w:p>
-    <w:p>
-      <w:pPr>
-        <w:pStyle w:val="BodyText"/>
-      </w:pPr>
-      <w:r>
-        <w:t xml:space="preserve">HH7</w:t>
-      </w:r>
-    </w:p>
-    <w:p>
-      <w:pPr>
-        <w:pStyle w:val="BodyText"/>
-      </w:pPr>
-      <w:r>
-        <w:t xml:space="preserve">Average number of meals per day, in the last 7 days</w:t>
-      </w:r>
-    </w:p>
-    <w:p>
-      <w:pPr>
-        <w:pStyle w:val="BodyText"/>
-      </w:pPr>
-      <w:r>
-        <w:t xml:space="preserve">Household</w:t>
-      </w:r>
-    </w:p>
-    <w:p>
-      <w:pPr>
-        <w:pStyle w:val="BodyText"/>
-      </w:pPr>
-      <w:r>
-        <w:t xml:space="preserve">Optional</w:t>
-      </w:r>
-    </w:p>
-    <w:p>
-      <w:pPr>
-        <w:pStyle w:val="BodyText"/>
-      </w:pPr>
-      <w:r>
-        <w:t xml:space="preserve">Food Security Cluster</w:t>
-      </w:r>
-    </w:p>
-    <w:p>
-      <w:pPr>
-        <w:pStyle w:val="BodyText"/>
-      </w:pPr>
-      <w:r>
-        <w:t xml:space="preserve">HH8</w:t>
-      </w:r>
-    </w:p>
-    <w:p>
-      <w:pPr>
-        <w:pStyle w:val="BodyText"/>
-      </w:pPr>
-      <w:r>
-        <w:t xml:space="preserve">Coping strategies used in the last 30 days</w:t>
-      </w:r>
-    </w:p>
-    <w:p>
-      <w:pPr>
-        <w:pStyle w:val="BodyText"/>
-      </w:pPr>
-      <w:r>
-        <w:t xml:space="preserve">Household</w:t>
-      </w:r>
-    </w:p>
-    <w:p>
-      <w:pPr>
-        <w:pStyle w:val="BodyText"/>
-      </w:pPr>
-      <w:r>
-        <w:t xml:space="preserve">Optional</w:t>
-      </w:r>
-    </w:p>
-    <w:p>
-      <w:pPr>
-        <w:pStyle w:val="BodyText"/>
-      </w:pPr>
-      <w:r>
-        <w:t xml:space="preserve">Food Security Cluster</w:t>
-      </w:r>
-    </w:p>
-    <w:p>
-      <w:pPr>
-        <w:pStyle w:val="BodyText"/>
-      </w:pPr>
-      <w:r>
-        <w:t xml:space="preserve">HH9</w:t>
-      </w:r>
-    </w:p>
-    <w:p>
-      <w:pPr>
-        <w:pStyle w:val="BodyText"/>
-      </w:pPr>
-      <w:r>
-        <w:t xml:space="preserve">Current assistance from other agencies</w:t>
-      </w:r>
-    </w:p>
-    <w:p>
-      <w:pPr>
-        <w:pStyle w:val="BodyText"/>
-      </w:pPr>
-      <w:r>
-        <w:t xml:space="preserve">Household</w:t>
-      </w:r>
-    </w:p>
-    <w:p>
-      <w:pPr>
-        <w:pStyle w:val="BodyText"/>
-      </w:pPr>
-      <w:r>
-        <w:t xml:space="preserve">Optional</w:t>
-      </w:r>
-    </w:p>
-    <w:p>
-      <w:pPr>
-        <w:pStyle w:val="BodyText"/>
-      </w:pPr>
-      <w:r>
-        <w:t xml:space="preserve">Cash Consortium</w:t>
-      </w:r>
-    </w:p>
-    <w:p>
-      <w:pPr>
-        <w:pStyle w:val="BodyText"/>
-      </w:pPr>
-      <w:r>
-        <w:t xml:space="preserve">HH10</w:t>
-      </w:r>
-    </w:p>
-    <w:p>
-      <w:pPr>
-        <w:pStyle w:val="BodyText"/>
-      </w:pPr>
-      <w:r>
-        <w:t xml:space="preserve">Household has member with disability / functional difficulty</w:t>
-      </w:r>
-    </w:p>
-    <w:p>
-      <w:pPr>
-        <w:pStyle w:val="BodyText"/>
-      </w:pPr>
-      <w:r>
-        <w:t xml:space="preserve">Household</w:t>
-      </w:r>
-    </w:p>
-    <w:p>
-      <w:pPr>
-        <w:pStyle w:val="BodyText"/>
-      </w:pPr>
-      <w:r>
-        <w:t xml:space="preserve">Core</w:t>
-      </w:r>
-    </w:p>
-    <w:p>
-      <w:pPr>
-        <w:pStyle w:val="BodyText"/>
-      </w:pPr>
-      <w:r>
-        <w:t xml:space="preserve">Cash Consortium + Inter-agency</w:t>
-      </w:r>
-    </w:p>
-    <w:p>
-      <w:pPr>
-        <w:pStyle w:val="BodyText"/>
-      </w:pPr>
-      <w:r>
-        <w:t xml:space="preserve">HH11</w:t>
-      </w:r>
-    </w:p>
-    <w:p>
-      <w:pPr>
-        <w:pStyle w:val="BodyText"/>
-      </w:pPr>
-      <w:r>
-        <w:t xml:space="preserve">Does your household have sufficent access to water for domestic use and drinking</w:t>
-      </w:r>
-    </w:p>
-    <w:p>
-      <w:pPr>
-        <w:pStyle w:val="BodyText"/>
-      </w:pPr>
-      <w:r>
-        <w:t xml:space="preserve">Household</w:t>
-      </w:r>
-    </w:p>
-    <w:p>
-      <w:pPr>
-        <w:pStyle w:val="BodyText"/>
-      </w:pPr>
-      <w:r>
-        <w:t xml:space="preserve">Optional</w:t>
-      </w:r>
-    </w:p>
-    <w:p>
-      <w:pPr>
-        <w:pStyle w:val="BodyText"/>
-      </w:pPr>
-      <w:r>
-        <w:t xml:space="preserve">Somalia SRF</w:t>
-      </w:r>
-    </w:p>
-    <w:p>
-      <w:pPr>
-        <w:pStyle w:val="BodyText"/>
-      </w:pPr>
-      <w:r>
-        <w:t xml:space="preserve">HH12</w:t>
-      </w:r>
-    </w:p>
-    <w:p>
-      <w:pPr>
-        <w:pStyle w:val="BodyText"/>
-      </w:pPr>
-      <w:r>
-        <w:t xml:space="preserve">What is the main source of water for your household?</w:t>
-      </w:r>
-    </w:p>
-    <w:p>
-      <w:pPr>
-        <w:pStyle w:val="BodyText"/>
-      </w:pPr>
-      <w:r>
-        <w:t xml:space="preserve">Household</w:t>
-      </w:r>
-    </w:p>
-    <w:p>
-      <w:pPr>
-        <w:pStyle w:val="BodyText"/>
-      </w:pPr>
-      <w:r>
-        <w:t xml:space="preserve">Optional</w:t>
-      </w:r>
-    </w:p>
-    <w:p>
-      <w:pPr>
-        <w:pStyle w:val="BodyText"/>
-      </w:pPr>
-      <w:r>
-        <w:t xml:space="preserve">Somalia SRF</w:t>
-      </w:r>
-    </w:p>
-    <w:p>
-      <w:pPr>
-        <w:pStyle w:val="BodyText"/>
-      </w:pPr>
-      <w:r>
-        <w:t xml:space="preserve">HH13</w:t>
-      </w:r>
-    </w:p>
-    <w:p>
-      <w:pPr>
-        <w:pStyle w:val="BodyText"/>
-      </w:pPr>
-      <w:r>
-        <w:t xml:space="preserve">What type of toilet facilities do your household use?</w:t>
-      </w:r>
-    </w:p>
-    <w:p>
-      <w:pPr>
-        <w:pStyle w:val="BodyText"/>
-      </w:pPr>
-      <w:r>
-        <w:t xml:space="preserve">Household</w:t>
-      </w:r>
-    </w:p>
-    <w:p>
-      <w:pPr>
-        <w:pStyle w:val="BodyText"/>
-      </w:pPr>
-      <w:r>
-        <w:t xml:space="preserve">Optional</w:t>
-      </w:r>
-    </w:p>
-    <w:p>
-      <w:pPr>
-        <w:pStyle w:val="BodyText"/>
-      </w:pPr>
-      <w:r>
-        <w:t xml:space="preserve">Somalia SRF</w:t>
-      </w:r>
-    </w:p>
-    <w:p>
-      <w:pPr>
-        <w:pStyle w:val="BodyText"/>
-      </w:pPr>
-      <w:r>
-        <w:t xml:space="preserve">Source:</w:t>
-      </w:r>
-      <w:r>
-        <w:t xml:space="preserve"> </w:t>
-      </w:r>
-      <w:r>
-        <w:t xml:space="preserve">Response-level SRF (draft).xlsx</w:t>
-      </w:r>
-      <w:r>
-        <w:t xml:space="preserve">, sheet</w:t>
-      </w:r>
-      <w:r>
-        <w:t xml:space="preserve"> </w:t>
-      </w:r>
-      <w:r>
-        <w:t xml:space="preserve">Fields</w:t>
-      </w:r>
-      <w:r>
-        <w:t xml:space="preserve">.</w:t>
-      </w:r>
-    </w:p>
-    <w:bookmarkEnd w:id="51"/>
+        <w:drawing>
+          <wp:inline>
+            <wp:extent cx="5334000" cy="6837332"/>
+            <wp:effectExtent b="0" l="0" r="0" t="0"/>
+            <wp:docPr descr="" title="" id="64" name="Picture"/>
+            <a:graphic>
+              <a:graphicData uri="http://schemas.openxmlformats.org/drawingml/2006/picture">
+                <pic:pic>
+                  <pic:nvPicPr>
+                    <pic:cNvPr descr="_tables/tbl-srf-fields-part3.png" id="65" name="Picture"/>
+                    <pic:cNvPicPr>
+                      <a:picLocks noChangeArrowheads="1" noChangeAspect="1"/>
+                    </pic:cNvPicPr>
+                  </pic:nvPicPr>
+                  <pic:blipFill>
+                    <a:blip r:embed="rId63"/>
+                    <a:stretch>
+                      <a:fillRect/>
+                    </a:stretch>
+                  </pic:blipFill>
+                  <pic:spPr bwMode="auto">
+                    <a:xfrm>
+                      <a:off x="0" y="0"/>
+                      <a:ext cx="5334000" cy="6837332"/>
+                    </a:xfrm>
+                    <a:prstGeom prst="rect">
+                      <a:avLst/>
+                    </a:prstGeom>
+                    <a:noFill/>
+                    <a:ln w="9525">
+                      <a:noFill/>
+                      <a:headEnd/>
+                      <a:tailEnd/>
+                    </a:ln>
+                  </pic:spPr>
+                </pic:pic>
+              </a:graphicData>
+            </a:graphic>
+          </wp:inline>
+        </w:drawing>
+      </w:r>
+    </w:p>
     <w:tbl>
       <w:tblPr>
         <w:tblStyle w:val="Table"/>
@@ -4246,18 +2110,18 @@
                 <wp:inline>
                   <wp:extent cx="152400" cy="152400"/>
                   <wp:effectExtent b="0" l="0" r="0" t="0"/>
-                  <wp:docPr descr="" title="" id="52" name="Picture"/>
+                  <wp:docPr descr="" title="" id="66" name="Picture"/>
                   <a:graphic>
                     <a:graphicData uri="http://schemas.openxmlformats.org/drawingml/2006/picture">
                       <pic:pic>
                         <pic:nvPicPr>
-                          <pic:cNvPr descr="/Applications/quarto/share/formats/docx/note.png" id="53" name="Picture"/>
+                          <pic:cNvPr descr="/Applications/quarto/share/formats/docx/note.png" id="67" name="Picture"/>
                           <pic:cNvPicPr>
                             <a:picLocks noChangeArrowheads="1" noChangeAspect="1"/>
                           </pic:cNvPicPr>
                         </pic:nvPicPr>
                         <pic:blipFill>
-                          <a:blip r:embed="rId35"/>
+                          <a:blip r:embed="rId37"/>
                           <a:stretch>
                             <a:fillRect/>
                           </a:stretch>
@@ -4370,18 +2234,18 @@
                 <wp:inline>
                   <wp:extent cx="152400" cy="152400"/>
                   <wp:effectExtent b="0" l="0" r="0" t="0"/>
-                  <wp:docPr descr="" title="" id="54" name="Picture"/>
+                  <wp:docPr descr="" title="" id="68" name="Picture"/>
                   <a:graphic>
                     <a:graphicData uri="http://schemas.openxmlformats.org/drawingml/2006/picture">
                       <pic:pic>
                         <pic:nvPicPr>
-                          <pic:cNvPr descr="/Applications/quarto/share/formats/docx/note.png" id="55" name="Picture"/>
+                          <pic:cNvPr descr="/Applications/quarto/share/formats/docx/note.png" id="69" name="Picture"/>
                           <pic:cNvPicPr>
                             <a:picLocks noChangeArrowheads="1" noChangeAspect="1"/>
                           </pic:cNvPicPr>
                         </pic:nvPicPr>
                         <pic:blipFill>
-                          <a:blip r:embed="rId35"/>
+                          <a:blip r:embed="rId37"/>
                           <a:stretch>
                             <a:fillRect/>
                           </a:stretch>
@@ -4445,8 +2309,8 @@
         </w:tc>
       </w:tr>
     </w:tbl>
-    <w:bookmarkEnd w:id="56"/>
-    <w:bookmarkStart w:id="64" w:name="methodological-guidance"/>
+    <w:bookmarkEnd w:id="70"/>
+    <w:bookmarkStart w:id="82" w:name="methodological-guidance"/>
     <w:p>
       <w:pPr>
         <w:pStyle w:val="Heading1"/>
@@ -4455,7 +2319,7 @@
         <w:t xml:space="preserve">8. Methodological Guidance</w:t>
       </w:r>
     </w:p>
-    <w:bookmarkStart w:id="58" w:name="deduplication"/>
+    <w:bookmarkStart w:id="74" w:name="deduplication"/>
     <w:p>
       <w:pPr>
         <w:pStyle w:val="Heading2"/>
@@ -4518,152 +2382,53 @@
         <w:t xml:space="preserve">— for deduplication where organizations are presented with 3 methods, in an order of preference based on accuracy and reliability for deduplication, but can choose fallback options where any of the primary options are not feasible.</w:t>
       </w:r>
     </w:p>
-    <w:bookmarkStart w:id="57" w:name="gt-dedup-ladder"/>
     <w:p>
       <w:pPr>
         <w:pStyle w:val="BodyText"/>
       </w:pPr>
       <w:r>
-        <w:t xml:space="preserve">Deduplication fallback ladder</w:t>
-      </w:r>
-    </w:p>
-    <w:p>
-      <w:pPr>
-        <w:pStyle w:val="BodyText"/>
-      </w:pPr>
-      <w:r>
-        <w:t xml:space="preserve">Two-thumb biometric is preferred; photo is the fallback; data-field matching is the last resort</w:t>
-      </w:r>
-    </w:p>
-    <w:p>
-      <w:pPr>
-        <w:pStyle w:val="BodyText"/>
-      </w:pPr>
-      <w:r>
-        <w:t xml:space="preserve">Tier</w:t>
-      </w:r>
-    </w:p>
-    <w:p>
-      <w:pPr>
-        <w:pStyle w:val="BodyText"/>
-      </w:pPr>
-      <w:r>
-        <w:t xml:space="preserve">Status</w:t>
-      </w:r>
-    </w:p>
-    <w:p>
-      <w:pPr>
-        <w:pStyle w:val="BodyText"/>
-      </w:pPr>
-      <w:r>
-        <w:t xml:space="preserve">Method</w:t>
-      </w:r>
-    </w:p>
-    <w:p>
-      <w:pPr>
-        <w:pStyle w:val="BodyText"/>
-      </w:pPr>
-      <w:r>
-        <w:t xml:space="preserve">When to use it</w:t>
-      </w:r>
-    </w:p>
-    <w:p>
-      <w:pPr>
-        <w:pStyle w:val="BodyText"/>
-      </w:pPr>
-      <w:r>
-        <w:t xml:space="preserve">1</w:t>
-      </w:r>
-    </w:p>
-    <w:p>
-      <w:pPr>
-        <w:pStyle w:val="BodyText"/>
-      </w:pPr>
-      <w:r>
-        <w:t xml:space="preserve">Preferred</w:t>
-      </w:r>
-    </w:p>
-    <w:p>
-      <w:pPr>
-        <w:pStyle w:val="BodyText"/>
-      </w:pPr>
-      <w:r>
-        <w:t xml:space="preserve">Two-thumb biometric capture</w:t>
-      </w:r>
-    </w:p>
-    <w:p>
-      <w:pPr>
-        <w:pStyle w:val="BodyText"/>
-      </w:pPr>
-      <w:r>
-        <w:t xml:space="preserve">Default at any registration site that has working biometric capture devices</w:t>
-      </w:r>
-    </w:p>
-    <w:p>
-      <w:pPr>
-        <w:pStyle w:val="BodyText"/>
-      </w:pPr>
-      <w:r>
-        <w:t xml:space="preserve">2</w:t>
-      </w:r>
-    </w:p>
-    <w:p>
-      <w:pPr>
-        <w:pStyle w:val="BodyText"/>
-      </w:pPr>
-      <w:r>
-        <w:t xml:space="preserve">Fallback</w:t>
-      </w:r>
-    </w:p>
-    <w:p>
-      <w:pPr>
-        <w:pStyle w:val="BodyText"/>
-      </w:pPr>
-      <w:r>
-        <w:t xml:space="preserve">Photo biometric capture</w:t>
-      </w:r>
-    </w:p>
-    <w:p>
-      <w:pPr>
-        <w:pStyle w:val="BodyText"/>
-      </w:pPr>
-      <w:r>
-        <w:t xml:space="preserve">When fingerprint capture is not possible — fingerprints unreadable, amputation, equipment failure, or unavailable hardware</w:t>
-      </w:r>
-    </w:p>
-    <w:p>
-      <w:pPr>
-        <w:pStyle w:val="BodyText"/>
-      </w:pPr>
-      <w:r>
-        <w:t xml:space="preserve">3</w:t>
-      </w:r>
-    </w:p>
-    <w:p>
-      <w:pPr>
-        <w:pStyle w:val="BodyText"/>
-      </w:pPr>
-      <w:r>
-        <w:t xml:space="preserve">Last fallback</w:t>
-      </w:r>
-    </w:p>
-    <w:p>
-      <w:pPr>
-        <w:pStyle w:val="BodyText"/>
-      </w:pPr>
-      <w:r>
-        <w:t xml:space="preserve">Data-field based matching</w:t>
-      </w:r>
-    </w:p>
-    <w:p>
-      <w:pPr>
-        <w:pStyle w:val="BodyText"/>
-      </w:pPr>
-      <w:r>
-        <w:t xml:space="preserve">When neither fingerprints nor a usable photo can be captured. Matching is then performed on combinations of biographic fields (name, DOB, location, phone, civil ID, household composition).</w:t>
-      </w:r>
-    </w:p>
-    <w:bookmarkEnd w:id="57"/>
+        <w:drawing>
+          <wp:inline>
+            <wp:extent cx="5334000" cy="2536613"/>
+            <wp:effectExtent b="0" l="0" r="0" t="0"/>
+            <wp:docPr descr="" title="" id="72" name="Picture"/>
+            <a:graphic>
+              <a:graphicData uri="http://schemas.openxmlformats.org/drawingml/2006/picture">
+                <pic:pic>
+                  <pic:nvPicPr>
+                    <pic:cNvPr descr="_tables/tbl-dedup-ladder.png" id="73" name="Picture"/>
+                    <pic:cNvPicPr>
+                      <a:picLocks noChangeArrowheads="1" noChangeAspect="1"/>
+                    </pic:cNvPicPr>
+                  </pic:nvPicPr>
+                  <pic:blipFill>
+                    <a:blip r:embed="rId71"/>
+                    <a:stretch>
+                      <a:fillRect/>
+                    </a:stretch>
+                  </pic:blipFill>
+                  <pic:spPr bwMode="auto">
+                    <a:xfrm>
+                      <a:off x="0" y="0"/>
+                      <a:ext cx="5334000" cy="2536613"/>
+                    </a:xfrm>
+                    <a:prstGeom prst="rect">
+                      <a:avLst/>
+                    </a:prstGeom>
+                    <a:noFill/>
+                    <a:ln w="9525">
+                      <a:noFill/>
+                      <a:headEnd/>
+                      <a:tailEnd/>
+                    </a:ln>
+                  </pic:spPr>
+                </pic:pic>
+              </a:graphicData>
+            </a:graphic>
+          </wp:inline>
+        </w:drawing>
+      </w:r>
+    </w:p>
     <w:p>
       <w:pPr>
         <w:pStyle w:val="BodyText"/>
@@ -4758,8 +2523,8 @@
         <w:t xml:space="preserve">For Tier 3, it is important to note that data field-based deduplication heavily relied on fields that have high availability, have high correlation with individuals or households, and have a degree of verifiability. An example of high availability would be if everybody or the vast majority of people have a phone number. An example of correlation would be where a national ID card is used. An example of verifiability could be a phone number, where the phone can be called to confirm ownership or use of the claimed number. In South Sudan, the low availability of data fields that match these three criteria, significantly impact the feasibility of Tier 3 for deduplication. This is compounded by the lack of photos in some existing registrations, a key requirement for adjudication of duplicates, both from an internal and intra organizational perspective.</w:t>
       </w:r>
     </w:p>
-    <w:bookmarkEnd w:id="58"/>
-    <w:bookmarkStart w:id="62" w:name="specificity"/>
+    <w:bookmarkEnd w:id="74"/>
+    <w:bookmarkStart w:id="80" w:name="specificity"/>
     <w:p>
       <w:pPr>
         <w:pStyle w:val="Heading2"/>
@@ -4841,200 +2606,53 @@
         <w:t xml:space="preserve">The two options have very different implications:</w:t>
       </w:r>
     </w:p>
-    <w:bookmarkStart w:id="59" w:name="gt-hoh-vs-all"/>
     <w:p>
       <w:pPr>
         <w:pStyle w:val="BodyText"/>
       </w:pPr>
       <w:r>
-        <w:t xml:space="preserve">Head-of-household only vs. all members</w:t>
-      </w:r>
-    </w:p>
-    <w:p>
-      <w:pPr>
-        <w:pStyle w:val="BodyText"/>
-      </w:pPr>
-      <w:r>
-        <w:t xml:space="preserve">Tradeoffs to resolve before the SRF is locked</w:t>
-      </w:r>
-    </w:p>
-    <w:p>
-      <w:pPr>
-        <w:pStyle w:val="BodyText"/>
-      </w:pPr>
-      <w:r>
-        <w:t xml:space="preserve">Dimension</w:t>
-      </w:r>
-    </w:p>
-    <w:p>
-      <w:pPr>
-        <w:pStyle w:val="BodyText"/>
-      </w:pPr>
-      <w:r>
-        <w:t xml:space="preserve">Registration option</w:t>
-      </w:r>
-    </w:p>
-    <w:p>
-      <w:pPr>
-        <w:pStyle w:val="BodyText"/>
-      </w:pPr>
-      <w:r>
-        <w:t xml:space="preserve">Head-of-household only</w:t>
-      </w:r>
-    </w:p>
-    <w:p>
-      <w:pPr>
-        <w:pStyle w:val="BodyText"/>
-      </w:pPr>
-      <w:r>
-        <w:t xml:space="preserve">All members roster</w:t>
-      </w:r>
-    </w:p>
-    <w:p>
-      <w:pPr>
-        <w:pStyle w:val="BodyText"/>
-      </w:pPr>
-      <w:r>
-        <w:t xml:space="preserve">Registration time per HH</w:t>
-      </w:r>
-    </w:p>
-    <w:p>
-      <w:pPr>
-        <w:pStyle w:val="BodyText"/>
-      </w:pPr>
-      <w:r>
-        <w:t xml:space="preserve">Short</w:t>
-      </w:r>
-    </w:p>
-    <w:p>
-      <w:pPr>
-        <w:pStyle w:val="BodyText"/>
-      </w:pPr>
-      <w:r>
-        <w:t xml:space="preserve">Significantly longer</w:t>
-      </w:r>
-    </w:p>
-    <w:p>
-      <w:pPr>
-        <w:pStyle w:val="BodyText"/>
-      </w:pPr>
-      <w:r>
-        <w:t xml:space="preserve">Deduplication strength</w:t>
-      </w:r>
-    </w:p>
-    <w:p>
-      <w:pPr>
-        <w:pStyle w:val="BodyText"/>
-      </w:pPr>
-      <w:r>
-        <w:t xml:space="preserve">Weaker — relies on HoH match + HH attributes</w:t>
-      </w:r>
-    </w:p>
-    <w:p>
-      <w:pPr>
-        <w:pStyle w:val="BodyText"/>
-      </w:pPr>
-      <w:r>
-        <w:t xml:space="preserve">Stronger — every member becomes a matchable record</w:t>
-      </w:r>
-    </w:p>
-    <w:p>
-      <w:pPr>
-        <w:pStyle w:val="BodyText"/>
-      </w:pPr>
-      <w:r>
-        <w:t xml:space="preserve">Data protection surface</w:t>
-      </w:r>
-    </w:p>
-    <w:p>
-      <w:pPr>
-        <w:pStyle w:val="BodyText"/>
-      </w:pPr>
-      <w:r>
-        <w:t xml:space="preserve">Smaller dataset to safeguard</w:t>
-      </w:r>
-    </w:p>
-    <w:p>
-      <w:pPr>
-        <w:pStyle w:val="BodyText"/>
-      </w:pPr>
-      <w:r>
-        <w:t xml:space="preserve">Larger dataset; child data and sensitive attributes at scale</w:t>
-      </w:r>
-    </w:p>
-    <w:p>
-      <w:pPr>
-        <w:pStyle w:val="BodyText"/>
-      </w:pPr>
-      <w:r>
-        <w:t xml:space="preserve">Targeting / referral</w:t>
-      </w:r>
-    </w:p>
-    <w:p>
-      <w:pPr>
-        <w:pStyle w:val="BodyText"/>
-      </w:pPr>
-      <w:r>
-        <w:t xml:space="preserve">Adequate for HH-level transfers</w:t>
-      </w:r>
-    </w:p>
-    <w:p>
-      <w:pPr>
-        <w:pStyle w:val="BodyText"/>
-      </w:pPr>
-      <w:r>
-        <w:t xml:space="preserve">Required for child-focused, nutrition, or per-person assistance</w:t>
-      </w:r>
-    </w:p>
-    <w:p>
-      <w:pPr>
-        <w:pStyle w:val="BodyText"/>
-      </w:pPr>
-      <w:r>
-        <w:t xml:space="preserve">Cross-agency reuse</w:t>
-      </w:r>
-    </w:p>
-    <w:p>
-      <w:pPr>
-        <w:pStyle w:val="BodyText"/>
-      </w:pPr>
-      <w:r>
-        <w:t xml:space="preserve">Limited — hard to follow individuals across agencies</w:t>
-      </w:r>
-    </w:p>
-    <w:p>
-      <w:pPr>
-        <w:pStyle w:val="BodyText"/>
-      </w:pPr>
-      <w:r>
-        <w:t xml:space="preserve">High — supports member-level case management</w:t>
-      </w:r>
-    </w:p>
-    <w:p>
-      <w:pPr>
-        <w:pStyle w:val="BodyText"/>
-      </w:pPr>
-      <w:r>
-        <w:t xml:space="preserve">Vulnerability to splitting</w:t>
-      </w:r>
-    </w:p>
-    <w:p>
-      <w:pPr>
-        <w:pStyle w:val="BodyText"/>
-      </w:pPr>
-      <w:r>
-        <w:t xml:space="preserve">High — a household can split between agencies undetected</w:t>
-      </w:r>
-    </w:p>
-    <w:p>
-      <w:pPr>
-        <w:pStyle w:val="BodyText"/>
-      </w:pPr>
-      <w:r>
-        <w:t xml:space="preserve">Low — individuals re-appear under a known name / DOB</w:t>
-      </w:r>
-    </w:p>
-    <w:bookmarkEnd w:id="59"/>
+        <w:drawing>
+          <wp:inline>
+            <wp:extent cx="5334000" cy="3461173"/>
+            <wp:effectExtent b="0" l="0" r="0" t="0"/>
+            <wp:docPr descr="" title="" id="76" name="Picture"/>
+            <a:graphic>
+              <a:graphicData uri="http://schemas.openxmlformats.org/drawingml/2006/picture">
+                <pic:pic>
+                  <pic:nvPicPr>
+                    <pic:cNvPr descr="_tables/tbl-hoh-vs-all.png" id="77" name="Picture"/>
+                    <pic:cNvPicPr>
+                      <a:picLocks noChangeArrowheads="1" noChangeAspect="1"/>
+                    </pic:cNvPicPr>
+                  </pic:nvPicPr>
+                  <pic:blipFill>
+                    <a:blip r:embed="rId75"/>
+                    <a:stretch>
+                      <a:fillRect/>
+                    </a:stretch>
+                  </pic:blipFill>
+                  <pic:spPr bwMode="auto">
+                    <a:xfrm>
+                      <a:off x="0" y="0"/>
+                      <a:ext cx="5334000" cy="3461173"/>
+                    </a:xfrm>
+                    <a:prstGeom prst="rect">
+                      <a:avLst/>
+                    </a:prstGeom>
+                    <a:noFill/>
+                    <a:ln w="9525">
+                      <a:noFill/>
+                      <a:headEnd/>
+                      <a:tailEnd/>
+                    </a:ln>
+                  </pic:spPr>
+                </pic:pic>
+              </a:graphicData>
+            </a:graphic>
+          </wp:inline>
+        </w:drawing>
+      </w:r>
+    </w:p>
     <w:p>
       <w:pPr>
         <w:pStyle w:val="BodyText"/>
@@ -5121,18 +2739,18 @@
                 <wp:inline>
                   <wp:extent cx="152400" cy="152400"/>
                   <wp:effectExtent b="0" l="0" r="0" t="0"/>
-                  <wp:docPr descr="" title="" id="60" name="Picture"/>
+                  <wp:docPr descr="" title="" id="78" name="Picture"/>
                   <a:graphic>
                     <a:graphicData uri="http://schemas.openxmlformats.org/drawingml/2006/picture">
                       <pic:pic>
                         <pic:nvPicPr>
-                          <pic:cNvPr descr="/Applications/quarto/share/formats/docx/note.png" id="61" name="Picture"/>
+                          <pic:cNvPr descr="/Applications/quarto/share/formats/docx/note.png" id="79" name="Picture"/>
                           <pic:cNvPicPr>
                             <a:picLocks noChangeArrowheads="1" noChangeAspect="1"/>
                           </pic:cNvPicPr>
                         </pic:nvPicPr>
                         <pic:blipFill>
-                          <a:blip r:embed="rId35"/>
+                          <a:blip r:embed="rId37"/>
                           <a:stretch>
                             <a:fillRect/>
                           </a:stretch>
@@ -5196,8 +2814,8 @@
         </w:tc>
       </w:tr>
     </w:tbl>
-    <w:bookmarkEnd w:id="62"/>
-    <w:bookmarkStart w:id="63" w:name="alternatives-2"/>
+    <w:bookmarkEnd w:id="80"/>
+    <w:bookmarkStart w:id="81" w:name="alternatives-2"/>
     <w:p>
       <w:pPr>
         <w:pStyle w:val="Heading2"/>
@@ -5302,9 +2920,9 @@
         <w:t xml:space="preserve">Rejected on operational grounds: the cost in registration time and data-protection surface is not justified in every context.</w:t>
       </w:r>
     </w:p>
-    <w:bookmarkEnd w:id="63"/>
-    <w:bookmarkEnd w:id="64"/>
-    <w:bookmarkStart w:id="65" w:name="annex-1-glossary"/>
+    <w:bookmarkEnd w:id="81"/>
+    <w:bookmarkEnd w:id="82"/>
+    <w:bookmarkStart w:id="83" w:name="annex-1-glossary"/>
     <w:p>
       <w:pPr>
         <w:pStyle w:val="Heading1"/>
@@ -5601,7 +3219,7 @@
         <w:t xml:space="preserve">Whether a field is captured per household or per individual. Independent of category.</w:t>
       </w:r>
     </w:p>
-    <w:bookmarkEnd w:id="65"/>
+    <w:bookmarkEnd w:id="83"/>
     <w:sectPr>
       <w:footnotePr>
         <w:numRestart w:val="eachSect"/>
@@ -5679,7 +3297,7 @@
       </w:hyperlink>
     </w:p>
   </w:footnote>
-  <w:footnote w:id="25">
+  <w:footnote w:id="27">
     <w:p>
       <w:pPr>
         <w:pStyle w:val="FootnoteText"/>
@@ -5693,7 +3311,7 @@
       <w:r>
         <w:t xml:space="preserve"> </w:t>
       </w:r>
-      <w:hyperlink r:id="rId26">
+      <w:hyperlink r:id="rId28">
         <w:r>
           <w:rPr>
             <w:rStyle w:val="Hyperlink"/>
@@ -5709,7 +3327,7 @@
       </w:r>
     </w:p>
   </w:footnote>
-  <w:footnote w:id="27">
+  <w:footnote w:id="29">
     <w:p>
       <w:pPr>
         <w:pStyle w:val="FootnoteText"/>
@@ -5723,7 +3341,7 @@
       <w:r>
         <w:t xml:space="preserve"> </w:t>
       </w:r>
-      <w:hyperlink r:id="rId28">
+      <w:hyperlink r:id="rId30">
         <w:r>
           <w:rPr>
             <w:rStyle w:val="Hyperlink"/>

</xml_diff>